<commit_message>
Regenerate devin-demo-talk-track.docx from python-docx script
Co-Authored-By: fabpen@hotmail.it <fabpen@hotmail.it>
</commit_message>
<xml_diff>
--- a/devin-demo-talk-track.docx
+++ b/devin-demo-talk-track.docx
@@ -14,10 +14,9 @@
         <w:rPr>
           <w:rFonts w:ascii="Calibri" w:hAnsi="Calibri"/>
           <w:b/>
-          <w:color w:val="1F3A68"/>
-          <w:sz w:val="64"/>
+          <w:sz w:val="48"/>
         </w:rPr>
-        <w:t>Devin Platform Demo</w:t>
+        <w:t>Devin Platform Demo — Java Upgrade with AI</w:t>
       </w:r>
     </w:p>
     <w:p>
@@ -27,29 +26,12 @@
       <w:r>
         <w:rPr>
           <w:rFonts w:ascii="Calibri" w:hAnsi="Calibri"/>
-          <w:color w:val="1F3A68"/>
-          <w:sz w:val="40"/>
-        </w:rPr>
-        <w:t>Java Upgrade with AI</w:t>
-      </w:r>
-    </w:p>
-    <w:p/>
-    <w:p/>
-    <w:p>
-      <w:pPr>
-        <w:jc w:val="center"/>
-      </w:pPr>
-      <w:r>
-        <w:rPr>
-          <w:rFonts w:ascii="Calibri" w:hAnsi="Calibri"/>
           <w:i/>
-          <w:color w:val="555555"/>
-          <w:sz w:val="32"/>
+          <w:sz w:val="28"/>
         </w:rPr>
         <w:t>Talk Track &amp; Script</w:t>
       </w:r>
     </w:p>
-    <w:p/>
     <w:p/>
     <w:p/>
     <w:p/>
@@ -63,7 +45,7 @@
           <w:b/>
           <w:sz w:val="24"/>
         </w:rPr>
-        <w:t xml:space="preserve">Repository:  </w:t>
+        <w:t xml:space="preserve">Repository: </w:t>
       </w:r>
       <w:r>
         <w:rPr>
@@ -83,7 +65,7 @@
           <w:b/>
           <w:sz w:val="24"/>
         </w:rPr>
-        <w:t xml:space="preserve">Estimated Duration:  </w:t>
+        <w:t xml:space="preserve">Estimated Duration: </w:t>
       </w:r>
       <w:r>
         <w:rPr>
@@ -103,10 +85,6 @@
         <w:pStyle w:val="Heading1"/>
       </w:pPr>
       <w:r>
-        <w:rPr>
-          <w:rFonts w:ascii="Calibri" w:hAnsi="Calibri"/>
-          <w:color w:val="1F3A68"/>
-        </w:rPr>
         <w:t>SCENE 1 — Introduction to the Platform (3 min)</w:t>
       </w:r>
     </w:p>
@@ -118,6 +96,7 @@
         <w:rPr>
           <w:rFonts w:ascii="Calibri" w:hAnsi="Calibri"/>
           <w:b/>
+          <w:sz w:val="22"/>
         </w:rPr>
         <w:t>[SLIDE: Devin Overview]</w:t>
       </w:r>
@@ -130,18 +109,15 @@
         <w:rPr>
           <w:rFonts w:ascii="Calibri" w:hAnsi="Calibri"/>
           <w:b/>
+          <w:sz w:val="22"/>
         </w:rPr>
         <w:t>Speaker script:</w:t>
       </w:r>
     </w:p>
     <w:p>
       <w:pPr>
-        <w:spacing w:before="0" w:after="120"/>
-        <w:ind w:left="454" w:right="227"/>
-        <w:pBdr>
-          <w:left w:val="single" w:sz="18" w:space="8" w:color="1F3A68"/>
-        </w:pBdr>
-        <w:shd w:val="clear" w:color="auto" w:fill="F4F6FA"/>
+        <w:spacing w:after="120"/>
+        <w:ind w:left="432"/>
       </w:pPr>
       <w:r>
         <w:rPr>
@@ -153,12 +129,8 @@
     </w:p>
     <w:p>
       <w:pPr>
-        <w:spacing w:before="0" w:after="120"/>
-        <w:ind w:left="454" w:right="227"/>
-        <w:pBdr>
-          <w:left w:val="single" w:sz="18" w:space="8" w:color="1F3A68"/>
-        </w:pBdr>
-        <w:shd w:val="clear" w:color="auto" w:fill="F4F6FA"/>
+        <w:spacing w:after="120"/>
+        <w:ind w:left="432"/>
       </w:pPr>
       <w:r>
         <w:rPr>
@@ -170,49 +142,15 @@
     </w:p>
     <w:p>
       <w:pPr>
-        <w:spacing w:before="0" w:after="120"/>
-        <w:ind w:left="454" w:right="227"/>
-        <w:pBdr>
-          <w:left w:val="single" w:sz="18" w:space="8" w:color="1F3A68"/>
-        </w:pBdr>
-        <w:shd w:val="clear" w:color="auto" w:fill="F4F6FA"/>
+        <w:spacing w:after="120"/>
+        <w:ind w:left="432"/>
       </w:pPr>
       <w:r>
         <w:rPr>
           <w:rFonts w:ascii="Calibri" w:hAnsi="Calibri"/>
           <w:sz w:val="22"/>
         </w:rPr>
-        <w:t xml:space="preserve">But the most important thing: Devin doesn't have to work alone. You can create a </w:t>
-      </w:r>
-      <w:r>
-        <w:rPr>
-          <w:rFonts w:ascii="Calibri" w:hAnsi="Calibri"/>
-          <w:b/>
-          <w:sz w:val="22"/>
-        </w:rPr>
-        <w:t>Tech Lead Devin</w:t>
-      </w:r>
-      <w:r>
-        <w:rPr>
-          <w:rFonts w:ascii="Calibri" w:hAnsi="Calibri"/>
-          <w:sz w:val="22"/>
-        </w:rPr>
-        <w:t xml:space="preserve"> that coordinates multiple </w:t>
-      </w:r>
-      <w:r>
-        <w:rPr>
-          <w:rFonts w:ascii="Calibri" w:hAnsi="Calibri"/>
-          <w:b/>
-          <w:sz w:val="22"/>
-        </w:rPr>
-        <w:t>Child Devins</w:t>
-      </w:r>
-      <w:r>
-        <w:rPr>
-          <w:rFonts w:ascii="Calibri" w:hAnsi="Calibri"/>
-          <w:sz w:val="22"/>
-        </w:rPr>
-        <w:t xml:space="preserve"> in parallel, each focused on a specific task. This is the model we'll see today to execute a complex upgrade in a rapid and structured way.</w:t>
+        <w:t>But the most important thing: Devin doesn't have to work alone. You can create a Tech Lead Devin that coordinates multiple Child Devins in parallel, each focused on a specific task. This is the model we'll see today to execute a complex upgrade in a rapid and structured way.</w:t>
       </w:r>
     </w:p>
     <w:p>
@@ -225,10 +163,6 @@
         <w:pStyle w:val="Heading1"/>
       </w:pPr>
       <w:r>
-        <w:rPr>
-          <w:rFonts w:ascii="Calibri" w:hAnsi="Calibri"/>
-          <w:color w:val="1F3A68"/>
-        </w:rPr>
         <w:t>SCENE 2 — Devin Wiki: Understanding the Codebase in Seconds (3 min)</w:t>
       </w:r>
     </w:p>
@@ -240,8 +174,9 @@
         <w:rPr>
           <w:rFonts w:ascii="Calibri" w:hAnsi="Calibri"/>
           <w:b/>
+          <w:sz w:val="22"/>
         </w:rPr>
-        <w:t>[ACTION: Open the Wiki for the `old-but-gold` repository]</w:t>
+        <w:t>[ACTION: Open the Wiki for the old-but-gold repository]</w:t>
       </w:r>
     </w:p>
     <w:p>
@@ -252,114 +187,54 @@
         <w:rPr>
           <w:rFonts w:ascii="Calibri" w:hAnsi="Calibri"/>
           <w:b/>
+          <w:sz w:val="22"/>
         </w:rPr>
         <w:t>Speaker script:</w:t>
       </w:r>
     </w:p>
     <w:p>
       <w:pPr>
-        <w:spacing w:before="0" w:after="120"/>
-        <w:ind w:left="454" w:right="227"/>
-        <w:pBdr>
-          <w:left w:val="single" w:sz="18" w:space="8" w:color="1F3A68"/>
-        </w:pBdr>
-        <w:shd w:val="clear" w:color="auto" w:fill="F4F6FA"/>
+        <w:spacing w:after="120"/>
+        <w:ind w:left="432"/>
       </w:pPr>
       <w:r>
         <w:rPr>
           <w:rFonts w:ascii="Calibri" w:hAnsi="Calibri"/>
           <w:sz w:val="22"/>
         </w:rPr>
-        <w:t xml:space="preserve">Before touching a single line of code, we need to understand what we're dealing with. Devin automatically generates a </w:t>
-      </w:r>
-      <w:r>
-        <w:rPr>
-          <w:rFonts w:ascii="Calibri" w:hAnsi="Calibri"/>
-          <w:b/>
-          <w:sz w:val="22"/>
-        </w:rPr>
-        <w:t>Wiki</w:t>
-      </w:r>
-      <w:r>
-        <w:rPr>
-          <w:rFonts w:ascii="Calibri" w:hAnsi="Calibri"/>
-          <w:sz w:val="22"/>
-        </w:rPr>
-        <w:t xml:space="preserve"> for every repository. This isn't static documentation — it's a navigable map of the architecture, generated by analyzing the source code.</w:t>
+        <w:t>Before touching a single line of code, we need to understand what we're dealing with. Devin automatically generates a Wiki for every repository. This isn't static documentation — it's a navigable map of the architecture, generated by analyzing the source code.</w:t>
       </w:r>
     </w:p>
     <w:p>
       <w:pPr>
-        <w:spacing w:before="0" w:after="120"/>
-        <w:ind w:left="454" w:right="227"/>
-        <w:pBdr>
-          <w:left w:val="single" w:sz="18" w:space="8" w:color="1F3A68"/>
-        </w:pBdr>
-        <w:shd w:val="clear" w:color="auto" w:fill="F4F6FA"/>
+        <w:spacing w:after="120"/>
+        <w:ind w:left="432"/>
       </w:pPr>
       <w:r>
         <w:rPr>
           <w:rFonts w:ascii="Calibri" w:hAnsi="Calibri"/>
           <w:sz w:val="22"/>
         </w:rPr>
-        <w:t xml:space="preserve">Let's look at this project's Wiki. The </w:t>
-      </w:r>
-      <w:r>
-        <w:rPr>
-          <w:rFonts w:ascii="Calibri" w:hAnsi="Calibri"/>
-          <w:b/>
-          <w:sz w:val="22"/>
-        </w:rPr>
-        <w:t>Overview</w:t>
-      </w:r>
-      <w:r>
-        <w:rPr>
-          <w:rFonts w:ascii="Calibri" w:hAnsi="Calibri"/>
-          <w:sz w:val="22"/>
-        </w:rPr>
-        <w:t xml:space="preserve"> page immediately tells us this is a Spring Boot 2.7 application on Java 11, with an H2 in-memory database, legacy Spring Security, MapStruct, and Lombok.</w:t>
+        <w:t>Let's look at this project's Wiki. The Overview page immediately tells us this is a Spring Boot 2.7 application on Java 11, with an H2 in-memory database, legacy Spring Security, MapStruct, and Lombok.</w:t>
       </w:r>
     </w:p>
     <w:p>
       <w:pPr>
-        <w:spacing w:before="0" w:after="120"/>
-        <w:ind w:left="454" w:right="227"/>
-        <w:pBdr>
-          <w:left w:val="single" w:sz="18" w:space="8" w:color="1F3A68"/>
-        </w:pBdr>
-        <w:shd w:val="clear" w:color="auto" w:fill="F4F6FA"/>
+        <w:spacing w:after="120"/>
+        <w:ind w:left="432"/>
       </w:pPr>
       <w:r>
         <w:rPr>
           <w:rFonts w:ascii="Calibri" w:hAnsi="Calibri"/>
           <w:sz w:val="22"/>
         </w:rPr>
-        <w:t xml:space="preserve">The </w:t>
-      </w:r>
-      <w:r>
-        <w:rPr>
-          <w:rFonts w:ascii="Calibri" w:hAnsi="Calibri"/>
-          <w:b/>
-          <w:sz w:val="22"/>
-        </w:rPr>
-        <w:t>Migration Goals and Legacy Pain Points</w:t>
-      </w:r>
-      <w:r>
-        <w:rPr>
-          <w:rFonts w:ascii="Calibri" w:hAnsi="Calibri"/>
-          <w:sz w:val="22"/>
-        </w:rPr>
-        <w:t xml:space="preserve"> section automatically identifies the key issues: `javax.*` imports that need to become `jakarta.*`, a deprecated `WebSecurityConfigurerAdapter`, an old Lombok version incompatible with JDK 17, and JUnit 4 legacy tests.</w:t>
+        <w:t>The Migration Goals and Legacy Pain Points section automatically identifies the key issues: javax.* imports that need to become jakarta.*, a deprecated WebSecurityConfigurerAdapter, an old Lombok version incompatible with JDK 17, and JUnit 4 legacy tests.</w:t>
       </w:r>
     </w:p>
     <w:p>
       <w:pPr>
-        <w:spacing w:before="0" w:after="120"/>
-        <w:ind w:left="454" w:right="227"/>
-        <w:pBdr>
-          <w:left w:val="single" w:sz="18" w:space="8" w:color="1F3A68"/>
-        </w:pBdr>
-        <w:shd w:val="clear" w:color="auto" w:fill="F4F6FA"/>
+        <w:spacing w:after="120"/>
+        <w:ind w:left="432"/>
       </w:pPr>
       <w:r>
         <w:rPr>
@@ -379,10 +254,6 @@
         <w:pStyle w:val="Heading1"/>
       </w:pPr>
       <w:r>
-        <w:rPr>
-          <w:rFonts w:ascii="Calibri" w:hAnsi="Calibri"/>
-          <w:color w:val="1F3A68"/>
-        </w:rPr>
         <w:t>SCENE 3 — Asking Questions to the Codebase (4 min)</w:t>
       </w:r>
     </w:p>
@@ -394,8 +265,9 @@
         <w:rPr>
           <w:rFonts w:ascii="Calibri" w:hAnsi="Calibri"/>
           <w:b/>
+          <w:sz w:val="22"/>
         </w:rPr>
-        <w:t>[ACTION: Open Devin chat and type "show me the codebase"]</w:t>
+        <w:t>[ACTION: Open Devin chat and type “show me the codebase”]</w:t>
       </w:r>
     </w:p>
     <w:p>
@@ -406,52 +278,41 @@
         <w:rPr>
           <w:rFonts w:ascii="Calibri" w:hAnsi="Calibri"/>
           <w:b/>
+          <w:sz w:val="22"/>
         </w:rPr>
         <w:t>Speaker script:</w:t>
       </w:r>
     </w:p>
     <w:p>
       <w:pPr>
-        <w:spacing w:before="0" w:after="120"/>
-        <w:ind w:left="454" w:right="227"/>
-        <w:pBdr>
-          <w:left w:val="single" w:sz="18" w:space="8" w:color="1F3A68"/>
-        </w:pBdr>
-        <w:shd w:val="clear" w:color="auto" w:fill="F4F6FA"/>
+        <w:spacing w:after="120"/>
+        <w:ind w:left="432"/>
       </w:pPr>
       <w:r>
         <w:rPr>
           <w:rFonts w:ascii="Calibri" w:hAnsi="Calibri"/>
           <w:sz w:val="22"/>
         </w:rPr>
-        <w:t>Now let's interact with Devin directly. I'll start with a simple question: "show me the codebase." Watch how Devin doesn't just list files — it gives us a structured overview of the entire project: the technology stack, the architecture, the key source files, and even a diagram of how the components connect.</w:t>
+        <w:t>Now let's interact with Devin directly. I'll start with a simple question: “show me the codebase.” Watch how Devin doesn't just list files — it gives us a structured overview of the entire project: the technology stack, the architecture, the key source files, and even a diagram of how the components connect.</w:t>
       </w:r>
     </w:p>
     <w:p>
       <w:pPr>
-        <w:spacing w:before="0" w:after="120"/>
-        <w:ind w:left="454" w:right="227"/>
-        <w:pBdr>
-          <w:left w:val="single" w:sz="18" w:space="8" w:color="1F3A68"/>
-        </w:pBdr>
-        <w:shd w:val="clear" w:color="auto" w:fill="F4F6FA"/>
+        <w:spacing w:after="120"/>
+        <w:ind w:left="432"/>
       </w:pPr>
       <w:r>
         <w:rPr>
           <w:rFonts w:ascii="Calibri" w:hAnsi="Calibri"/>
           <w:sz w:val="22"/>
         </w:rPr>
-        <w:t>Devin identified the entry point, the JPA entity with its `javax.persistence` imports, the REST controllers, the MapStruct mapper, the security configuration using the deprecated adapter pattern, and the test files — including the legacy JUnit 4 test.</w:t>
+        <w:t>Devin identified the entry point, the JPA entity with its javax.persistence imports, the REST controllers, the MapStruct mapper, the security configuration using the deprecated adapter pattern, and the test files — including the legacy JUnit 4 test.</w:t>
       </w:r>
     </w:p>
     <w:p>
       <w:pPr>
-        <w:spacing w:before="0" w:after="120"/>
-        <w:ind w:left="454" w:right="227"/>
-        <w:pBdr>
-          <w:left w:val="single" w:sz="18" w:space="8" w:color="1F3A68"/>
-        </w:pBdr>
-        <w:shd w:val="clear" w:color="auto" w:fill="F4F6FA"/>
+        <w:spacing w:after="120"/>
+        <w:ind w:left="432"/>
       </w:pPr>
       <w:r>
         <w:rPr>
@@ -469,6 +330,7 @@
         <w:rPr>
           <w:rFonts w:ascii="Calibri" w:hAnsi="Calibri"/>
           <w:b/>
+          <w:sz w:val="22"/>
         </w:rPr>
         <w:t>[HIGHLIGHT: The architecture diagram and the technology stack table in Devin's response]</w:t>
       </w:r>
@@ -483,10 +345,6 @@
         <w:pStyle w:val="Heading1"/>
       </w:pPr>
       <w:r>
-        <w:rPr>
-          <w:rFonts w:ascii="Calibri" w:hAnsi="Calibri"/>
-          <w:color w:val="1F3A68"/>
-        </w:rPr>
         <w:t>SCENE 4 — Finding Bugs (4 min)</w:t>
       </w:r>
     </w:p>
@@ -498,8 +356,9 @@
         <w:rPr>
           <w:rFonts w:ascii="Calibri" w:hAnsi="Calibri"/>
           <w:b/>
+          <w:sz w:val="22"/>
         </w:rPr>
-        <w:t>[ACTION: Type "find bugs"]</w:t>
+        <w:t>[ACTION: Type “find bugs”]</w:t>
       </w:r>
     </w:p>
     <w:p>
@@ -510,18 +369,15 @@
         <w:rPr>
           <w:rFonts w:ascii="Calibri" w:hAnsi="Calibri"/>
           <w:b/>
+          <w:sz w:val="22"/>
         </w:rPr>
         <w:t>Speaker script:</w:t>
       </w:r>
     </w:p>
     <w:p>
       <w:pPr>
-        <w:spacing w:before="0" w:after="120"/>
-        <w:ind w:left="454" w:right="227"/>
-        <w:pBdr>
-          <w:left w:val="single" w:sz="18" w:space="8" w:color="1F3A68"/>
-        </w:pBdr>
-        <w:shd w:val="clear" w:color="auto" w:fill="F4F6FA"/>
+        <w:spacing w:after="120"/>
+        <w:ind w:left="432"/>
       </w:pPr>
       <w:r>
         <w:rPr>
@@ -533,12 +389,8 @@
     </w:p>
     <w:p>
       <w:pPr>
-        <w:spacing w:before="0" w:after="120"/>
-        <w:ind w:left="454" w:right="227"/>
-        <w:pBdr>
-          <w:left w:val="single" w:sz="18" w:space="8" w:color="1F3A68"/>
-        </w:pBdr>
-        <w:shd w:val="clear" w:color="auto" w:fill="F4F6FA"/>
+        <w:spacing w:after="120"/>
+        <w:ind w:left="432"/>
       </w:pPr>
       <w:r>
         <w:rPr>
@@ -546,24 +398,20 @@
           <w:b/>
           <w:sz w:val="22"/>
         </w:rPr>
-        <w:t>Bug #1 — Mass Assignment:</w:t>
+        <w:t xml:space="preserve">Bug #1 — Mass Assignment: </w:t>
       </w:r>
       <w:r>
         <w:rPr>
           <w:rFonts w:ascii="Calibri" w:hAnsi="Calibri"/>
           <w:sz w:val="22"/>
         </w:rPr>
-        <w:t xml:space="preserve"> The POST endpoint maps the full DTO including the `id` field to the entity. If a client sends a JSON body with an existing ID, Spring Data's `save()` performs an UPDATE instead of an INSERT. An attacker can overwrite any user record through the create endpoint.</w:t>
+        <w:t>The POST endpoint maps the full DTO including the id field to the entity. If a client sends a JSON body with an existing ID, Spring Data's save() performs an UPDATE instead of an INSERT. An attacker can overwrite any user record through the create endpoint.</w:t>
       </w:r>
     </w:p>
     <w:p>
       <w:pPr>
-        <w:spacing w:before="0" w:after="120"/>
-        <w:ind w:left="454" w:right="227"/>
-        <w:pBdr>
-          <w:left w:val="single" w:sz="18" w:space="8" w:color="1F3A68"/>
-        </w:pBdr>
-        <w:shd w:val="clear" w:color="auto" w:fill="F4F6FA"/>
+        <w:spacing w:after="120"/>
+        <w:ind w:left="432"/>
       </w:pPr>
       <w:r>
         <w:rPr>
@@ -571,24 +419,20 @@
           <w:b/>
           <w:sz w:val="22"/>
         </w:rPr>
-        <w:t>Bug #2 — Broken equals/hashCode:</w:t>
+        <w:t xml:space="preserve">Bug #2 — Broken equals/hashCode: </w:t>
       </w:r>
       <w:r>
         <w:rPr>
           <w:rFonts w:ascii="Calibri" w:hAnsi="Calibri"/>
           <w:sz w:val="22"/>
         </w:rPr>
-        <w:t xml:space="preserve"> The `User` entity uses Lombok's `@Data`, which generates `equals()` and `hashCode()` based on all fields including `id`. Since `id` is null before persistence and assigned after, the same entity has different hash codes before and after save. This breaks Sets, Maps, and any collection-based JPA relationship.</w:t>
+        <w:t>The User entity uses Lombok's @Data, which generates equals() and hashCode() based on all fields including id. Since id is null before persistence and assigned after, the same entity has different hash codes before and after save. This breaks Sets, Maps, and any collection-based JPA relationship.</w:t>
       </w:r>
     </w:p>
     <w:p>
       <w:pPr>
-        <w:spacing w:before="0" w:after="120"/>
-        <w:ind w:left="454" w:right="227"/>
-        <w:pBdr>
-          <w:left w:val="single" w:sz="18" w:space="8" w:color="1F3A68"/>
-        </w:pBdr>
-        <w:shd w:val="clear" w:color="auto" w:fill="F4F6FA"/>
+        <w:spacing w:after="120"/>
+        <w:ind w:left="432"/>
       </w:pPr>
       <w:r>
         <w:rPr>
@@ -596,24 +440,20 @@
           <w:b/>
           <w:sz w:val="22"/>
         </w:rPr>
-        <w:t>Bug #3 — Reflected URL:</w:t>
+        <w:t xml:space="preserve">Bug #3 — Reflected URL: </w:t>
       </w:r>
       <w:r>
         <w:rPr>
           <w:rFonts w:ascii="Calibri" w:hAnsi="Calibri"/>
           <w:sz w:val="22"/>
         </w:rPr>
-        <w:t xml:space="preserve"> The `GreetingController` reflects `request.getRequestURL()` directly into the response. The URL is built from the client-controlled `Host` header — a header injection vulnerability.</w:t>
+        <w:t>The GreetingController reflects request.getRequestURL() directly into the response. The URL is built from the client-controlled Host header — a header injection vulnerability.</w:t>
       </w:r>
     </w:p>
     <w:p>
       <w:pPr>
-        <w:spacing w:before="0" w:after="120"/>
-        <w:ind w:left="454" w:right="227"/>
-        <w:pBdr>
-          <w:left w:val="single" w:sz="18" w:space="8" w:color="1F3A68"/>
-        </w:pBdr>
-        <w:shd w:val="clear" w:color="auto" w:fill="F4F6FA"/>
+        <w:spacing w:after="120"/>
+        <w:ind w:left="432"/>
       </w:pPr>
       <w:r>
         <w:rPr>
@@ -624,592 +464,6 @@
       </w:r>
     </w:p>
     <w:p>
-      <w:pPr>
-        <w:pStyle w:val="Heading2"/>
-      </w:pPr>
-      <w:r>
-        <w:rPr>
-          <w:rFonts w:ascii="Calibri" w:hAnsi="Calibri"/>
-        </w:rPr>
-        <w:t>Bug Summary</w:t>
-      </w:r>
-    </w:p>
-    <w:tbl>
-      <w:tblPr>
-        <w:tblStyle w:val="LightGrid-Accent1"/>
-        <w:tblW w:type="auto" w:w="0"/>
-        <w:tblLayout w:type="autofit"/>
-        <w:tblLook w:firstColumn="1" w:firstRow="1" w:lastColumn="0" w:lastRow="0" w:noHBand="0" w:noVBand="1" w:val="04A0"/>
-      </w:tblPr>
-      <w:tblGrid>
-        <w:gridCol w:w="2436"/>
-        <w:gridCol w:w="2436"/>
-        <w:gridCol w:w="2436"/>
-        <w:gridCol w:w="2436"/>
-      </w:tblGrid>
-      <w:tr>
-        <w:tc>
-          <w:tcPr>
-            <w:tcW w:type="dxa" w:w="2436"/>
-            <w:shd w:val="clear" w:color="auto" w:fill="1F3A68"/>
-            <w:vAlign w:val="center"/>
-          </w:tcPr>
-          <w:p>
-            <w:r/>
-            <w:r>
-              <w:rPr>
-                <w:rFonts w:ascii="Calibri" w:hAnsi="Calibri"/>
-                <w:b/>
-                <w:color w:val="FFFFFF"/>
-              </w:rPr>
-              <w:t>#</w:t>
-            </w:r>
-          </w:p>
-        </w:tc>
-        <w:tc>
-          <w:tcPr>
-            <w:tcW w:type="dxa" w:w="2436"/>
-            <w:shd w:val="clear" w:color="auto" w:fill="1F3A68"/>
-            <w:vAlign w:val="center"/>
-          </w:tcPr>
-          <w:p>
-            <w:r/>
-            <w:r>
-              <w:rPr>
-                <w:rFonts w:ascii="Calibri" w:hAnsi="Calibri"/>
-                <w:b/>
-                <w:color w:val="FFFFFF"/>
-              </w:rPr>
-              <w:t>Issue</w:t>
-            </w:r>
-          </w:p>
-        </w:tc>
-        <w:tc>
-          <w:tcPr>
-            <w:tcW w:type="dxa" w:w="2436"/>
-            <w:shd w:val="clear" w:color="auto" w:fill="1F3A68"/>
-            <w:vAlign w:val="center"/>
-          </w:tcPr>
-          <w:p>
-            <w:r/>
-            <w:r>
-              <w:rPr>
-                <w:rFonts w:ascii="Calibri" w:hAnsi="Calibri"/>
-                <w:b/>
-                <w:color w:val="FFFFFF"/>
-              </w:rPr>
-              <w:t>Severity</w:t>
-            </w:r>
-          </w:p>
-        </w:tc>
-        <w:tc>
-          <w:tcPr>
-            <w:tcW w:type="dxa" w:w="2436"/>
-            <w:shd w:val="clear" w:color="auto" w:fill="1F3A68"/>
-            <w:vAlign w:val="center"/>
-          </w:tcPr>
-          <w:p>
-            <w:r/>
-            <w:r>
-              <w:rPr>
-                <w:rFonts w:ascii="Calibri" w:hAnsi="Calibri"/>
-                <w:b/>
-                <w:color w:val="FFFFFF"/>
-              </w:rPr>
-              <w:t>Fix</w:t>
-            </w:r>
-          </w:p>
-        </w:tc>
-      </w:tr>
-      <w:tr>
-        <w:tc>
-          <w:tcPr>
-            <w:tcW w:type="dxa" w:w="2436"/>
-            <w:vAlign w:val="center"/>
-          </w:tcPr>
-          <w:p>
-            <w:r/>
-            <w:r>
-              <w:rPr>
-                <w:rFonts w:ascii="Calibri" w:hAnsi="Calibri"/>
-                <w:sz w:val="20"/>
-              </w:rPr>
-              <w:t>1</w:t>
-            </w:r>
-          </w:p>
-        </w:tc>
-        <w:tc>
-          <w:tcPr>
-            <w:tcW w:type="dxa" w:w="2436"/>
-            <w:vAlign w:val="center"/>
-          </w:tcPr>
-          <w:p>
-            <w:r/>
-            <w:r>
-              <w:rPr>
-                <w:rFonts w:ascii="Calibri" w:hAnsi="Calibri"/>
-                <w:b/>
-                <w:sz w:val="20"/>
-              </w:rPr>
-              <w:t>Mass Assignment</w:t>
-            </w:r>
-            <w:r>
-              <w:rPr>
-                <w:rFonts w:ascii="Calibri" w:hAnsi="Calibri"/>
-                <w:sz w:val="20"/>
-              </w:rPr>
-              <w:t xml:space="preserve"> — DTO `id` field is persisted on create</w:t>
-            </w:r>
-          </w:p>
-        </w:tc>
-        <w:tc>
-          <w:tcPr>
-            <w:tcW w:type="dxa" w:w="2436"/>
-            <w:vAlign w:val="center"/>
-          </w:tcPr>
-          <w:p>
-            <w:r/>
-            <w:r>
-              <w:rPr>
-                <w:rFonts w:ascii="Calibri" w:hAnsi="Calibri"/>
-                <w:sz w:val="20"/>
-              </w:rPr>
-              <w:t>High</w:t>
-            </w:r>
-          </w:p>
-        </w:tc>
-        <w:tc>
-          <w:tcPr>
-            <w:tcW w:type="dxa" w:w="2436"/>
-            <w:vAlign w:val="center"/>
-          </w:tcPr>
-          <w:p>
-            <w:r/>
-            <w:r>
-              <w:rPr>
-                <w:rFonts w:ascii="Calibri" w:hAnsi="Calibri"/>
-                <w:sz w:val="20"/>
-              </w:rPr>
-              <w:t>Strip/ignore `id` on POST; use a dedicated create DTO</w:t>
-            </w:r>
-          </w:p>
-        </w:tc>
-      </w:tr>
-      <w:tr>
-        <w:tc>
-          <w:tcPr>
-            <w:tcW w:type="dxa" w:w="2436"/>
-            <w:vAlign w:val="center"/>
-          </w:tcPr>
-          <w:p>
-            <w:r/>
-            <w:r>
-              <w:rPr>
-                <w:rFonts w:ascii="Calibri" w:hAnsi="Calibri"/>
-                <w:sz w:val="20"/>
-              </w:rPr>
-              <w:t>2</w:t>
-            </w:r>
-          </w:p>
-        </w:tc>
-        <w:tc>
-          <w:tcPr>
-            <w:tcW w:type="dxa" w:w="2436"/>
-            <w:vAlign w:val="center"/>
-          </w:tcPr>
-          <w:p>
-            <w:r/>
-            <w:r>
-              <w:rPr>
-                <w:rFonts w:ascii="Calibri" w:hAnsi="Calibri"/>
-                <w:b/>
-                <w:sz w:val="20"/>
-              </w:rPr>
-              <w:t>Broken equals/hashCode</w:t>
-            </w:r>
-            <w:r>
-              <w:rPr>
-                <w:rFonts w:ascii="Calibri" w:hAnsi="Calibri"/>
-                <w:sz w:val="20"/>
-              </w:rPr>
-              <w:t xml:space="preserve"> — Lombok `@Data` on JPA entity</w:t>
-            </w:r>
-          </w:p>
-        </w:tc>
-        <w:tc>
-          <w:tcPr>
-            <w:tcW w:type="dxa" w:w="2436"/>
-            <w:vAlign w:val="center"/>
-          </w:tcPr>
-          <w:p>
-            <w:r/>
-            <w:r>
-              <w:rPr>
-                <w:rFonts w:ascii="Calibri" w:hAnsi="Calibri"/>
-                <w:sz w:val="20"/>
-              </w:rPr>
-              <w:t>High</w:t>
-            </w:r>
-          </w:p>
-        </w:tc>
-        <w:tc>
-          <w:tcPr>
-            <w:tcW w:type="dxa" w:w="2436"/>
-            <w:vAlign w:val="center"/>
-          </w:tcPr>
-          <w:p>
-            <w:r/>
-            <w:r>
-              <w:rPr>
-                <w:rFonts w:ascii="Calibri" w:hAnsi="Calibri"/>
-                <w:sz w:val="20"/>
-              </w:rPr>
-              <w:t>Replace with `@Getter/@Setter` + id-based `equals/hashCode`</w:t>
-            </w:r>
-          </w:p>
-        </w:tc>
-      </w:tr>
-      <w:tr>
-        <w:tc>
-          <w:tcPr>
-            <w:tcW w:type="dxa" w:w="2436"/>
-            <w:vAlign w:val="center"/>
-          </w:tcPr>
-          <w:p>
-            <w:r/>
-            <w:r>
-              <w:rPr>
-                <w:rFonts w:ascii="Calibri" w:hAnsi="Calibri"/>
-                <w:sz w:val="20"/>
-              </w:rPr>
-              <w:t>3</w:t>
-            </w:r>
-          </w:p>
-        </w:tc>
-        <w:tc>
-          <w:tcPr>
-            <w:tcW w:type="dxa" w:w="2436"/>
-            <w:vAlign w:val="center"/>
-          </w:tcPr>
-          <w:p>
-            <w:r/>
-            <w:r>
-              <w:rPr>
-                <w:rFonts w:ascii="Calibri" w:hAnsi="Calibri"/>
-                <w:b/>
-                <w:sz w:val="20"/>
-              </w:rPr>
-              <w:t>Reflected URL</w:t>
-            </w:r>
-            <w:r>
-              <w:rPr>
-                <w:rFonts w:ascii="Calibri" w:hAnsi="Calibri"/>
-                <w:sz w:val="20"/>
-              </w:rPr>
-              <w:t xml:space="preserve"> via `Host` header in `GreetingController`</w:t>
-            </w:r>
-          </w:p>
-        </w:tc>
-        <w:tc>
-          <w:tcPr>
-            <w:tcW w:type="dxa" w:w="2436"/>
-            <w:vAlign w:val="center"/>
-          </w:tcPr>
-          <w:p>
-            <w:r/>
-            <w:r>
-              <w:rPr>
-                <w:rFonts w:ascii="Calibri" w:hAnsi="Calibri"/>
-                <w:sz w:val="20"/>
-              </w:rPr>
-              <w:t>High</w:t>
-            </w:r>
-          </w:p>
-        </w:tc>
-        <w:tc>
-          <w:tcPr>
-            <w:tcW w:type="dxa" w:w="2436"/>
-            <w:vAlign w:val="center"/>
-          </w:tcPr>
-          <w:p>
-            <w:r/>
-            <w:r>
-              <w:rPr>
-                <w:rFonts w:ascii="Calibri" w:hAnsi="Calibri"/>
-                <w:sz w:val="20"/>
-              </w:rPr>
-              <w:t>Use `ServletUriComponentsBuilder` / a trusted base URL</w:t>
-            </w:r>
-          </w:p>
-        </w:tc>
-      </w:tr>
-      <w:tr>
-        <w:tc>
-          <w:tcPr>
-            <w:tcW w:type="dxa" w:w="2436"/>
-            <w:vAlign w:val="center"/>
-          </w:tcPr>
-          <w:p>
-            <w:r/>
-            <w:r>
-              <w:rPr>
-                <w:rFonts w:ascii="Calibri" w:hAnsi="Calibri"/>
-                <w:sz w:val="20"/>
-              </w:rPr>
-              <w:t>4</w:t>
-            </w:r>
-          </w:p>
-        </w:tc>
-        <w:tc>
-          <w:tcPr>
-            <w:tcW w:type="dxa" w:w="2436"/>
-            <w:vAlign w:val="center"/>
-          </w:tcPr>
-          <w:p>
-            <w:r/>
-            <w:r>
-              <w:rPr>
-                <w:rFonts w:ascii="Calibri" w:hAnsi="Calibri"/>
-                <w:sz w:val="20"/>
-              </w:rPr>
-              <w:t>Weak input validation on DTO fields</w:t>
-            </w:r>
-          </w:p>
-        </w:tc>
-        <w:tc>
-          <w:tcPr>
-            <w:tcW w:type="dxa" w:w="2436"/>
-            <w:vAlign w:val="center"/>
-          </w:tcPr>
-          <w:p>
-            <w:r/>
-            <w:r>
-              <w:rPr>
-                <w:rFonts w:ascii="Calibri" w:hAnsi="Calibri"/>
-                <w:sz w:val="20"/>
-              </w:rPr>
-              <w:t>Medium</w:t>
-            </w:r>
-          </w:p>
-        </w:tc>
-        <w:tc>
-          <w:tcPr>
-            <w:tcW w:type="dxa" w:w="2436"/>
-            <w:vAlign w:val="center"/>
-          </w:tcPr>
-          <w:p>
-            <w:r/>
-            <w:r>
-              <w:rPr>
-                <w:rFonts w:ascii="Calibri" w:hAnsi="Calibri"/>
-                <w:sz w:val="20"/>
-              </w:rPr>
-              <w:t>Add `@Valid` + Bean Validation constraints</w:t>
-            </w:r>
-          </w:p>
-        </w:tc>
-      </w:tr>
-      <w:tr>
-        <w:tc>
-          <w:tcPr>
-            <w:tcW w:type="dxa" w:w="2436"/>
-            <w:vAlign w:val="center"/>
-          </w:tcPr>
-          <w:p>
-            <w:r/>
-            <w:r>
-              <w:rPr>
-                <w:rFonts w:ascii="Calibri" w:hAnsi="Calibri"/>
-                <w:sz w:val="20"/>
-              </w:rPr>
-              <w:t>5</w:t>
-            </w:r>
-          </w:p>
-        </w:tc>
-        <w:tc>
-          <w:tcPr>
-            <w:tcW w:type="dxa" w:w="2436"/>
-            <w:vAlign w:val="center"/>
-          </w:tcPr>
-          <w:p>
-            <w:r/>
-            <w:r>
-              <w:rPr>
-                <w:rFonts w:ascii="Calibri" w:hAnsi="Calibri"/>
-                <w:sz w:val="20"/>
-              </w:rPr>
-              <w:t>Missing pagination on list endpoints</w:t>
-            </w:r>
-          </w:p>
-        </w:tc>
-        <w:tc>
-          <w:tcPr>
-            <w:tcW w:type="dxa" w:w="2436"/>
-            <w:vAlign w:val="center"/>
-          </w:tcPr>
-          <w:p>
-            <w:r/>
-            <w:r>
-              <w:rPr>
-                <w:rFonts w:ascii="Calibri" w:hAnsi="Calibri"/>
-                <w:sz w:val="20"/>
-              </w:rPr>
-              <w:t>Medium</w:t>
-            </w:r>
-          </w:p>
-        </w:tc>
-        <w:tc>
-          <w:tcPr>
-            <w:tcW w:type="dxa" w:w="2436"/>
-            <w:vAlign w:val="center"/>
-          </w:tcPr>
-          <w:p>
-            <w:r/>
-            <w:r>
-              <w:rPr>
-                <w:rFonts w:ascii="Calibri" w:hAnsi="Calibri"/>
-                <w:sz w:val="20"/>
-              </w:rPr>
-              <w:t>Return `Page&lt;...&gt;` with `Pageable`</w:t>
-            </w:r>
-          </w:p>
-        </w:tc>
-      </w:tr>
-      <w:tr>
-        <w:tc>
-          <w:tcPr>
-            <w:tcW w:type="dxa" w:w="2436"/>
-            <w:vAlign w:val="center"/>
-          </w:tcPr>
-          <w:p>
-            <w:r/>
-            <w:r>
-              <w:rPr>
-                <w:rFonts w:ascii="Calibri" w:hAnsi="Calibri"/>
-                <w:sz w:val="20"/>
-              </w:rPr>
-              <w:t>6</w:t>
-            </w:r>
-          </w:p>
-        </w:tc>
-        <w:tc>
-          <w:tcPr>
-            <w:tcW w:type="dxa" w:w="2436"/>
-            <w:vAlign w:val="center"/>
-          </w:tcPr>
-          <w:p>
-            <w:r/>
-            <w:r>
-              <w:rPr>
-                <w:rFonts w:ascii="Calibri" w:hAnsi="Calibri"/>
-                <w:sz w:val="20"/>
-              </w:rPr>
-              <w:t>Verbose error responses leak stack traces</w:t>
-            </w:r>
-          </w:p>
-        </w:tc>
-        <w:tc>
-          <w:tcPr>
-            <w:tcW w:type="dxa" w:w="2436"/>
-            <w:vAlign w:val="center"/>
-          </w:tcPr>
-          <w:p>
-            <w:r/>
-            <w:r>
-              <w:rPr>
-                <w:rFonts w:ascii="Calibri" w:hAnsi="Calibri"/>
-                <w:sz w:val="20"/>
-              </w:rPr>
-              <w:t>Medium</w:t>
-            </w:r>
-          </w:p>
-        </w:tc>
-        <w:tc>
-          <w:tcPr>
-            <w:tcW w:type="dxa" w:w="2436"/>
-            <w:vAlign w:val="center"/>
-          </w:tcPr>
-          <w:p>
-            <w:r/>
-            <w:r>
-              <w:rPr>
-                <w:rFonts w:ascii="Calibri" w:hAnsi="Calibri"/>
-                <w:sz w:val="20"/>
-              </w:rPr>
-              <w:t>Centralize with `@ControllerAdvice`</w:t>
-            </w:r>
-          </w:p>
-        </w:tc>
-      </w:tr>
-      <w:tr>
-        <w:tc>
-          <w:tcPr>
-            <w:tcW w:type="dxa" w:w="2436"/>
-            <w:vAlign w:val="center"/>
-          </w:tcPr>
-          <w:p>
-            <w:r/>
-            <w:r>
-              <w:rPr>
-                <w:rFonts w:ascii="Calibri" w:hAnsi="Calibri"/>
-                <w:sz w:val="20"/>
-              </w:rPr>
-              <w:t>7</w:t>
-            </w:r>
-          </w:p>
-        </w:tc>
-        <w:tc>
-          <w:tcPr>
-            <w:tcW w:type="dxa" w:w="2436"/>
-            <w:vAlign w:val="center"/>
-          </w:tcPr>
-          <w:p>
-            <w:r/>
-            <w:r>
-              <w:rPr>
-                <w:rFonts w:ascii="Calibri" w:hAnsi="Calibri"/>
-                <w:sz w:val="20"/>
-              </w:rPr>
-              <w:t>Legacy JUnit 4 test skews coverage signal</w:t>
-            </w:r>
-          </w:p>
-        </w:tc>
-        <w:tc>
-          <w:tcPr>
-            <w:tcW w:type="dxa" w:w="2436"/>
-            <w:vAlign w:val="center"/>
-          </w:tcPr>
-          <w:p>
-            <w:r/>
-            <w:r>
-              <w:rPr>
-                <w:rFonts w:ascii="Calibri" w:hAnsi="Calibri"/>
-                <w:sz w:val="20"/>
-              </w:rPr>
-              <w:t>Low</w:t>
-            </w:r>
-          </w:p>
-        </w:tc>
-        <w:tc>
-          <w:tcPr>
-            <w:tcW w:type="dxa" w:w="2436"/>
-            <w:vAlign w:val="center"/>
-          </w:tcPr>
-          <w:p>
-            <w:r/>
-            <w:r>
-              <w:rPr>
-                <w:rFonts w:ascii="Calibri" w:hAnsi="Calibri"/>
-                <w:sz w:val="20"/>
-              </w:rPr>
-              <w:t>Migrate to JUnit 5</w:t>
-            </w:r>
-          </w:p>
-        </w:tc>
-      </w:tr>
-    </w:tbl>
-    <w:p/>
-    <w:p>
       <w:r>
         <w:br w:type="page"/>
       </w:r>
@@ -1219,10 +473,6 @@
         <w:pStyle w:val="Heading1"/>
       </w:pPr>
       <w:r>
-        <w:rPr>
-          <w:rFonts w:ascii="Calibri" w:hAnsi="Calibri"/>
-          <w:color w:val="1F3A68"/>
-        </w:rPr>
         <w:t>SCENE 5 — Finding Vulnerabilities (4 min)</w:t>
       </w:r>
     </w:p>
@@ -1234,8 +484,9 @@
         <w:rPr>
           <w:rFonts w:ascii="Calibri" w:hAnsi="Calibri"/>
           <w:b/>
+          <w:sz w:val="22"/>
         </w:rPr>
-        <w:t>[ACTION: Type "find vulnerabilities"]</w:t>
+        <w:t>[ACTION: Type “find vulnerabilities”]</w:t>
       </w:r>
     </w:p>
     <w:p>
@@ -1246,18 +497,15 @@
         <w:rPr>
           <w:rFonts w:ascii="Calibri" w:hAnsi="Calibri"/>
           <w:b/>
+          <w:sz w:val="22"/>
         </w:rPr>
         <w:t>Speaker script:</w:t>
       </w:r>
     </w:p>
     <w:p>
       <w:pPr>
-        <w:spacing w:before="0" w:after="120"/>
-        <w:ind w:left="454" w:right="227"/>
-        <w:pBdr>
-          <w:left w:val="single" w:sz="18" w:space="8" w:color="1F3A68"/>
-        </w:pBdr>
-        <w:shd w:val="clear" w:color="auto" w:fill="F4F6FA"/>
+        <w:spacing w:after="120"/>
+        <w:ind w:left="432"/>
       </w:pPr>
       <w:r>
         <w:rPr>
@@ -1269,12 +517,8 @@
     </w:p>
     <w:p>
       <w:pPr>
-        <w:spacing w:before="0" w:after="120"/>
-        <w:ind w:left="454" w:right="227"/>
-        <w:pBdr>
-          <w:left w:val="single" w:sz="18" w:space="8" w:color="1F3A68"/>
-        </w:pBdr>
-        <w:shd w:val="clear" w:color="auto" w:fill="F4F6FA"/>
+        <w:spacing w:after="120"/>
+        <w:ind w:left="432"/>
       </w:pPr>
       <w:r>
         <w:rPr>
@@ -1282,24 +526,20 @@
           <w:b/>
           <w:sz w:val="22"/>
         </w:rPr>
-        <w:t>Critical — CSRF disabled with session-based auth:</w:t>
+        <w:t xml:space="preserve">Critical — CSRF disabled with session-based auth: </w:t>
       </w:r>
       <w:r>
         <w:rPr>
           <w:rFonts w:ascii="Calibri" w:hAnsi="Calibri"/>
           <w:sz w:val="22"/>
         </w:rPr>
-        <w:t xml:space="preserve"> The app uses HTTP Basic authentication, which browsers cache and auto-send. With CSRF disabled, any malicious page can forge requests on behalf of an authenticated user. Devin even provides the exploit code.</w:t>
+        <w:t>The app uses HTTP Basic authentication, which browsers cache and auto-send. With CSRF disabled, any malicious page can forge requests on behalf of an authenticated user. Devin even provides the exploit code.</w:t>
       </w:r>
     </w:p>
     <w:p>
       <w:pPr>
-        <w:spacing w:before="0" w:after="120"/>
-        <w:ind w:left="454" w:right="227"/>
-        <w:pBdr>
-          <w:left w:val="single" w:sz="18" w:space="8" w:color="1F3A68"/>
-        </w:pBdr>
-        <w:shd w:val="clear" w:color="auto" w:fill="F4F6FA"/>
+        <w:spacing w:after="120"/>
+        <w:ind w:left="432"/>
       </w:pPr>
       <w:r>
         <w:rPr>
@@ -1307,24 +547,20 @@
           <w:b/>
           <w:sz w:val="22"/>
         </w:rPr>
-        <w:t>High — Hardcoded credentials:</w:t>
+        <w:t xml:space="preserve">High — Hardcoded credentials: </w:t>
       </w:r>
       <w:r>
         <w:rPr>
           <w:rFonts w:ascii="Calibri" w:hAnsi="Calibri"/>
           <w:sz w:val="22"/>
         </w:rPr>
-        <w:t xml:space="preserve"> Username and password are committed in plaintext in `application.yml`. Anyone with repo access has the credentials.</w:t>
+        <w:t>Username and password are committed in plaintext in application.yml. Anyone with repo access has the credentials.</w:t>
       </w:r>
     </w:p>
     <w:p>
       <w:pPr>
-        <w:spacing w:before="0" w:after="120"/>
-        <w:ind w:left="454" w:right="227"/>
-        <w:pBdr>
-          <w:left w:val="single" w:sz="18" w:space="8" w:color="1F3A68"/>
-        </w:pBdr>
-        <w:shd w:val="clear" w:color="auto" w:fill="F4F6FA"/>
+        <w:spacing w:after="120"/>
+        <w:ind w:left="432"/>
       </w:pPr>
       <w:r>
         <w:rPr>
@@ -1332,24 +568,20 @@
           <w:b/>
           <w:sz w:val="22"/>
         </w:rPr>
-        <w:t>High — Stored XSS:</w:t>
+        <w:t xml:space="preserve">High — Stored XSS: </w:t>
       </w:r>
       <w:r>
         <w:rPr>
           <w:rFonts w:ascii="Calibri" w:hAnsi="Calibri"/>
           <w:sz w:val="22"/>
         </w:rPr>
-        <w:t xml:space="preserve"> The `name` field accepts any characters including HTML and script tags. If this data is ever rendered in a browser, it's a stored XSS vector.</w:t>
+        <w:t>The name field accepts any characters including HTML and script tags. If this data is ever rendered in a browser, it's a stored XSS vector.</w:t>
       </w:r>
     </w:p>
     <w:p>
       <w:pPr>
-        <w:spacing w:before="0" w:after="120"/>
-        <w:ind w:left="454" w:right="227"/>
-        <w:pBdr>
-          <w:left w:val="single" w:sz="18" w:space="8" w:color="1F3A68"/>
-        </w:pBdr>
-        <w:shd w:val="clear" w:color="auto" w:fill="F4F6FA"/>
+        <w:spacing w:after="120"/>
+        <w:ind w:left="432"/>
       </w:pPr>
       <w:r>
         <w:rPr>
@@ -1357,24 +589,20 @@
           <w:b/>
           <w:sz w:val="22"/>
         </w:rPr>
-        <w:t>Medium — IDOR with enumerable IDs:</w:t>
+        <w:t xml:space="preserve">Medium — IDOR with enumerable IDs: </w:t>
       </w:r>
       <w:r>
         <w:rPr>
           <w:rFonts w:ascii="Calibri" w:hAnsi="Calibri"/>
           <w:sz w:val="22"/>
         </w:rPr>
-        <w:t xml:space="preserve"> Sequential integer IDs with no authorization checks mean any authenticated user can access any other user's data.</w:t>
+        <w:t>Sequential integer IDs with no authorization checks mean any authenticated user can access any other user's data.</w:t>
       </w:r>
     </w:p>
     <w:p>
       <w:pPr>
-        <w:spacing w:before="0" w:after="120"/>
-        <w:ind w:left="454" w:right="227"/>
-        <w:pBdr>
-          <w:left w:val="single" w:sz="18" w:space="8" w:color="1F3A68"/>
-        </w:pBdr>
-        <w:shd w:val="clear" w:color="auto" w:fill="F4F6FA"/>
+        <w:spacing w:after="120"/>
+        <w:ind w:left="432"/>
       </w:pPr>
       <w:r>
         <w:rPr>
@@ -1385,1059 +613,6 @@
       </w:r>
     </w:p>
     <w:p>
-      <w:pPr>
-        <w:pStyle w:val="Heading2"/>
-      </w:pPr>
-      <w:r>
-        <w:rPr>
-          <w:rFonts w:ascii="Calibri" w:hAnsi="Calibri"/>
-        </w:rPr>
-        <w:t>Vulnerability Summary</w:t>
-      </w:r>
-    </w:p>
-    <w:tbl>
-      <w:tblPr>
-        <w:tblStyle w:val="LightGrid-Accent1"/>
-        <w:tblW w:type="auto" w:w="0"/>
-        <w:tblLayout w:type="autofit"/>
-        <w:tblLook w:firstColumn="1" w:firstRow="1" w:lastColumn="0" w:lastRow="0" w:noHBand="0" w:noVBand="1" w:val="04A0"/>
-      </w:tblPr>
-      <w:tblGrid>
-        <w:gridCol w:w="1949"/>
-        <w:gridCol w:w="1949"/>
-        <w:gridCol w:w="1949"/>
-        <w:gridCol w:w="1949"/>
-        <w:gridCol w:w="1949"/>
-      </w:tblGrid>
-      <w:tr>
-        <w:tc>
-          <w:tcPr>
-            <w:tcW w:type="dxa" w:w="1949"/>
-            <w:shd w:val="clear" w:color="auto" w:fill="1F3A68"/>
-            <w:vAlign w:val="center"/>
-          </w:tcPr>
-          <w:p>
-            <w:r/>
-            <w:r>
-              <w:rPr>
-                <w:rFonts w:ascii="Calibri" w:hAnsi="Calibri"/>
-                <w:b/>
-                <w:color w:val="FFFFFF"/>
-              </w:rPr>
-              <w:t>#</w:t>
-            </w:r>
-          </w:p>
-        </w:tc>
-        <w:tc>
-          <w:tcPr>
-            <w:tcW w:type="dxa" w:w="1949"/>
-            <w:shd w:val="clear" w:color="auto" w:fill="1F3A68"/>
-            <w:vAlign w:val="center"/>
-          </w:tcPr>
-          <w:p>
-            <w:r/>
-            <w:r>
-              <w:rPr>
-                <w:rFonts w:ascii="Calibri" w:hAnsi="Calibri"/>
-                <w:b/>
-                <w:color w:val="FFFFFF"/>
-              </w:rPr>
-              <w:t>Vulnerability</w:t>
-            </w:r>
-          </w:p>
-        </w:tc>
-        <w:tc>
-          <w:tcPr>
-            <w:tcW w:type="dxa" w:w="1949"/>
-            <w:shd w:val="clear" w:color="auto" w:fill="1F3A68"/>
-            <w:vAlign w:val="center"/>
-          </w:tcPr>
-          <w:p>
-            <w:r/>
-            <w:r>
-              <w:rPr>
-                <w:rFonts w:ascii="Calibri" w:hAnsi="Calibri"/>
-                <w:b/>
-                <w:color w:val="FFFFFF"/>
-              </w:rPr>
-              <w:t>Severity</w:t>
-            </w:r>
-          </w:p>
-        </w:tc>
-        <w:tc>
-          <w:tcPr>
-            <w:tcW w:type="dxa" w:w="1949"/>
-            <w:shd w:val="clear" w:color="auto" w:fill="1F3A68"/>
-            <w:vAlign w:val="center"/>
-          </w:tcPr>
-          <w:p>
-            <w:r/>
-            <w:r>
-              <w:rPr>
-                <w:rFonts w:ascii="Calibri" w:hAnsi="Calibri"/>
-                <w:b/>
-                <w:color w:val="FFFFFF"/>
-              </w:rPr>
-              <w:t>OWASP</w:t>
-            </w:r>
-          </w:p>
-        </w:tc>
-        <w:tc>
-          <w:tcPr>
-            <w:tcW w:type="dxa" w:w="1949"/>
-            <w:shd w:val="clear" w:color="auto" w:fill="1F3A68"/>
-            <w:vAlign w:val="center"/>
-          </w:tcPr>
-          <w:p>
-            <w:r/>
-            <w:r>
-              <w:rPr>
-                <w:rFonts w:ascii="Calibri" w:hAnsi="Calibri"/>
-                <w:b/>
-                <w:color w:val="FFFFFF"/>
-              </w:rPr>
-              <w:t>Remediation</w:t>
-            </w:r>
-          </w:p>
-        </w:tc>
-      </w:tr>
-      <w:tr>
-        <w:tc>
-          <w:tcPr>
-            <w:tcW w:type="dxa" w:w="1949"/>
-            <w:vAlign w:val="center"/>
-          </w:tcPr>
-          <w:p>
-            <w:r/>
-            <w:r>
-              <w:rPr>
-                <w:rFonts w:ascii="Calibri" w:hAnsi="Calibri"/>
-                <w:sz w:val="20"/>
-              </w:rPr>
-              <w:t>1</w:t>
-            </w:r>
-          </w:p>
-        </w:tc>
-        <w:tc>
-          <w:tcPr>
-            <w:tcW w:type="dxa" w:w="1949"/>
-            <w:vAlign w:val="center"/>
-          </w:tcPr>
-          <w:p>
-            <w:r/>
-            <w:r>
-              <w:rPr>
-                <w:rFonts w:ascii="Calibri" w:hAnsi="Calibri"/>
-                <w:b/>
-                <w:sz w:val="20"/>
-              </w:rPr>
-              <w:t>CSRF disabled</w:t>
-            </w:r>
-            <w:r>
-              <w:rPr>
-                <w:rFonts w:ascii="Calibri" w:hAnsi="Calibri"/>
-                <w:sz w:val="20"/>
-              </w:rPr>
-              <w:t xml:space="preserve"> with session-based auth</w:t>
-            </w:r>
-          </w:p>
-        </w:tc>
-        <w:tc>
-          <w:tcPr>
-            <w:tcW w:type="dxa" w:w="1949"/>
-            <w:vAlign w:val="center"/>
-          </w:tcPr>
-          <w:p>
-            <w:r/>
-            <w:r>
-              <w:rPr>
-                <w:rFonts w:ascii="Calibri" w:hAnsi="Calibri"/>
-                <w:sz w:val="20"/>
-              </w:rPr>
-              <w:t>Critical</w:t>
-            </w:r>
-          </w:p>
-        </w:tc>
-        <w:tc>
-          <w:tcPr>
-            <w:tcW w:type="dxa" w:w="1949"/>
-            <w:vAlign w:val="center"/>
-          </w:tcPr>
-          <w:p>
-            <w:r/>
-            <w:r>
-              <w:rPr>
-                <w:rFonts w:ascii="Calibri" w:hAnsi="Calibri"/>
-                <w:sz w:val="20"/>
-              </w:rPr>
-              <w:t>A01: Broken Access Control</w:t>
-            </w:r>
-          </w:p>
-        </w:tc>
-        <w:tc>
-          <w:tcPr>
-            <w:tcW w:type="dxa" w:w="1949"/>
-            <w:vAlign w:val="center"/>
-          </w:tcPr>
-          <w:p>
-            <w:r/>
-            <w:r>
-              <w:rPr>
-                <w:rFonts w:ascii="Calibri" w:hAnsi="Calibri"/>
-                <w:sz w:val="20"/>
-              </w:rPr>
-              <w:t>Enable CSRF; use token-based auth for APIs</w:t>
-            </w:r>
-          </w:p>
-        </w:tc>
-      </w:tr>
-      <w:tr>
-        <w:tc>
-          <w:tcPr>
-            <w:tcW w:type="dxa" w:w="1949"/>
-            <w:vAlign w:val="center"/>
-          </w:tcPr>
-          <w:p>
-            <w:r/>
-            <w:r>
-              <w:rPr>
-                <w:rFonts w:ascii="Calibri" w:hAnsi="Calibri"/>
-                <w:sz w:val="20"/>
-              </w:rPr>
-              <w:t>2</w:t>
-            </w:r>
-          </w:p>
-        </w:tc>
-        <w:tc>
-          <w:tcPr>
-            <w:tcW w:type="dxa" w:w="1949"/>
-            <w:vAlign w:val="center"/>
-          </w:tcPr>
-          <w:p>
-            <w:r/>
-            <w:r>
-              <w:rPr>
-                <w:rFonts w:ascii="Calibri" w:hAnsi="Calibri"/>
-                <w:b/>
-                <w:sz w:val="20"/>
-              </w:rPr>
-              <w:t>Hardcoded credentials</w:t>
-            </w:r>
-            <w:r>
-              <w:rPr>
-                <w:rFonts w:ascii="Calibri" w:hAnsi="Calibri"/>
-                <w:sz w:val="20"/>
-              </w:rPr>
-              <w:t xml:space="preserve"> in `application.yml`</w:t>
-            </w:r>
-          </w:p>
-        </w:tc>
-        <w:tc>
-          <w:tcPr>
-            <w:tcW w:type="dxa" w:w="1949"/>
-            <w:vAlign w:val="center"/>
-          </w:tcPr>
-          <w:p>
-            <w:r/>
-            <w:r>
-              <w:rPr>
-                <w:rFonts w:ascii="Calibri" w:hAnsi="Calibri"/>
-                <w:sz w:val="20"/>
-              </w:rPr>
-              <w:t>High</w:t>
-            </w:r>
-          </w:p>
-        </w:tc>
-        <w:tc>
-          <w:tcPr>
-            <w:tcW w:type="dxa" w:w="1949"/>
-            <w:vAlign w:val="center"/>
-          </w:tcPr>
-          <w:p>
-            <w:r/>
-            <w:r>
-              <w:rPr>
-                <w:rFonts w:ascii="Calibri" w:hAnsi="Calibri"/>
-                <w:sz w:val="20"/>
-              </w:rPr>
-              <w:t>A07: Auth Failures</w:t>
-            </w:r>
-          </w:p>
-        </w:tc>
-        <w:tc>
-          <w:tcPr>
-            <w:tcW w:type="dxa" w:w="1949"/>
-            <w:vAlign w:val="center"/>
-          </w:tcPr>
-          <w:p>
-            <w:r/>
-            <w:r>
-              <w:rPr>
-                <w:rFonts w:ascii="Calibri" w:hAnsi="Calibri"/>
-                <w:sz w:val="20"/>
-              </w:rPr>
-              <w:t>Move to env vars / secret manager</w:t>
-            </w:r>
-          </w:p>
-        </w:tc>
-      </w:tr>
-      <w:tr>
-        <w:tc>
-          <w:tcPr>
-            <w:tcW w:type="dxa" w:w="1949"/>
-            <w:vAlign w:val="center"/>
-          </w:tcPr>
-          <w:p>
-            <w:r/>
-            <w:r>
-              <w:rPr>
-                <w:rFonts w:ascii="Calibri" w:hAnsi="Calibri"/>
-                <w:sz w:val="20"/>
-              </w:rPr>
-              <w:t>3</w:t>
-            </w:r>
-          </w:p>
-        </w:tc>
-        <w:tc>
-          <w:tcPr>
-            <w:tcW w:type="dxa" w:w="1949"/>
-            <w:vAlign w:val="center"/>
-          </w:tcPr>
-          <w:p>
-            <w:r/>
-            <w:r>
-              <w:rPr>
-                <w:rFonts w:ascii="Calibri" w:hAnsi="Calibri"/>
-                <w:b/>
-                <w:sz w:val="20"/>
-              </w:rPr>
-              <w:t>Stored XSS</w:t>
-            </w:r>
-            <w:r>
-              <w:rPr>
-                <w:rFonts w:ascii="Calibri" w:hAnsi="Calibri"/>
-                <w:sz w:val="20"/>
-              </w:rPr>
-              <w:t xml:space="preserve"> via unescaped `name` field</w:t>
-            </w:r>
-          </w:p>
-        </w:tc>
-        <w:tc>
-          <w:tcPr>
-            <w:tcW w:type="dxa" w:w="1949"/>
-            <w:vAlign w:val="center"/>
-          </w:tcPr>
-          <w:p>
-            <w:r/>
-            <w:r>
-              <w:rPr>
-                <w:rFonts w:ascii="Calibri" w:hAnsi="Calibri"/>
-                <w:sz w:val="20"/>
-              </w:rPr>
-              <w:t>High</w:t>
-            </w:r>
-          </w:p>
-        </w:tc>
-        <w:tc>
-          <w:tcPr>
-            <w:tcW w:type="dxa" w:w="1949"/>
-            <w:vAlign w:val="center"/>
-          </w:tcPr>
-          <w:p>
-            <w:r/>
-            <w:r>
-              <w:rPr>
-                <w:rFonts w:ascii="Calibri" w:hAnsi="Calibri"/>
-                <w:sz w:val="20"/>
-              </w:rPr>
-              <w:t>A03: Injection</w:t>
-            </w:r>
-          </w:p>
-        </w:tc>
-        <w:tc>
-          <w:tcPr>
-            <w:tcW w:type="dxa" w:w="1949"/>
-            <w:vAlign w:val="center"/>
-          </w:tcPr>
-          <w:p>
-            <w:r/>
-            <w:r>
-              <w:rPr>
-                <w:rFonts w:ascii="Calibri" w:hAnsi="Calibri"/>
-                <w:sz w:val="20"/>
-              </w:rPr>
-              <w:t>Validate + encode output</w:t>
-            </w:r>
-          </w:p>
-        </w:tc>
-      </w:tr>
-      <w:tr>
-        <w:tc>
-          <w:tcPr>
-            <w:tcW w:type="dxa" w:w="1949"/>
-            <w:vAlign w:val="center"/>
-          </w:tcPr>
-          <w:p>
-            <w:r/>
-            <w:r>
-              <w:rPr>
-                <w:rFonts w:ascii="Calibri" w:hAnsi="Calibri"/>
-                <w:sz w:val="20"/>
-              </w:rPr>
-              <w:t>4</w:t>
-            </w:r>
-          </w:p>
-        </w:tc>
-        <w:tc>
-          <w:tcPr>
-            <w:tcW w:type="dxa" w:w="1949"/>
-            <w:vAlign w:val="center"/>
-          </w:tcPr>
-          <w:p>
-            <w:r/>
-            <w:r>
-              <w:rPr>
-                <w:rFonts w:ascii="Calibri" w:hAnsi="Calibri"/>
-                <w:b/>
-                <w:sz w:val="20"/>
-              </w:rPr>
-              <w:t>IDOR</w:t>
-            </w:r>
-            <w:r>
-              <w:rPr>
-                <w:rFonts w:ascii="Calibri" w:hAnsi="Calibri"/>
-                <w:sz w:val="20"/>
-              </w:rPr>
-              <w:t xml:space="preserve"> with enumerable IDs</w:t>
-            </w:r>
-          </w:p>
-        </w:tc>
-        <w:tc>
-          <w:tcPr>
-            <w:tcW w:type="dxa" w:w="1949"/>
-            <w:vAlign w:val="center"/>
-          </w:tcPr>
-          <w:p>
-            <w:r/>
-            <w:r>
-              <w:rPr>
-                <w:rFonts w:ascii="Calibri" w:hAnsi="Calibri"/>
-                <w:sz w:val="20"/>
-              </w:rPr>
-              <w:t>Medium</w:t>
-            </w:r>
-          </w:p>
-        </w:tc>
-        <w:tc>
-          <w:tcPr>
-            <w:tcW w:type="dxa" w:w="1949"/>
-            <w:vAlign w:val="center"/>
-          </w:tcPr>
-          <w:p>
-            <w:r/>
-            <w:r>
-              <w:rPr>
-                <w:rFonts w:ascii="Calibri" w:hAnsi="Calibri"/>
-                <w:sz w:val="20"/>
-              </w:rPr>
-              <w:t>A01: Broken Access Control</w:t>
-            </w:r>
-          </w:p>
-        </w:tc>
-        <w:tc>
-          <w:tcPr>
-            <w:tcW w:type="dxa" w:w="1949"/>
-            <w:vAlign w:val="center"/>
-          </w:tcPr>
-          <w:p>
-            <w:r/>
-            <w:r>
-              <w:rPr>
-                <w:rFonts w:ascii="Calibri" w:hAnsi="Calibri"/>
-                <w:sz w:val="20"/>
-              </w:rPr>
-              <w:t>Per-resource authorization checks</w:t>
-            </w:r>
-          </w:p>
-        </w:tc>
-      </w:tr>
-      <w:tr>
-        <w:tc>
-          <w:tcPr>
-            <w:tcW w:type="dxa" w:w="1949"/>
-            <w:vAlign w:val="center"/>
-          </w:tcPr>
-          <w:p>
-            <w:r/>
-            <w:r>
-              <w:rPr>
-                <w:rFonts w:ascii="Calibri" w:hAnsi="Calibri"/>
-                <w:sz w:val="20"/>
-              </w:rPr>
-              <w:t>5</w:t>
-            </w:r>
-          </w:p>
-        </w:tc>
-        <w:tc>
-          <w:tcPr>
-            <w:tcW w:type="dxa" w:w="1949"/>
-            <w:vAlign w:val="center"/>
-          </w:tcPr>
-          <w:p>
-            <w:r/>
-            <w:r>
-              <w:rPr>
-                <w:rFonts w:ascii="Calibri" w:hAnsi="Calibri"/>
-                <w:sz w:val="20"/>
-              </w:rPr>
-              <w:t>HTTP Basic over any transport</w:t>
-            </w:r>
-          </w:p>
-        </w:tc>
-        <w:tc>
-          <w:tcPr>
-            <w:tcW w:type="dxa" w:w="1949"/>
-            <w:vAlign w:val="center"/>
-          </w:tcPr>
-          <w:p>
-            <w:r/>
-            <w:r>
-              <w:rPr>
-                <w:rFonts w:ascii="Calibri" w:hAnsi="Calibri"/>
-                <w:sz w:val="20"/>
-              </w:rPr>
-              <w:t>Medium</w:t>
-            </w:r>
-          </w:p>
-        </w:tc>
-        <w:tc>
-          <w:tcPr>
-            <w:tcW w:type="dxa" w:w="1949"/>
-            <w:vAlign w:val="center"/>
-          </w:tcPr>
-          <w:p>
-            <w:r/>
-            <w:r>
-              <w:rPr>
-                <w:rFonts w:ascii="Calibri" w:hAnsi="Calibri"/>
-                <w:sz w:val="20"/>
-              </w:rPr>
-              <w:t>A02: Crypto Failures</w:t>
-            </w:r>
-          </w:p>
-        </w:tc>
-        <w:tc>
-          <w:tcPr>
-            <w:tcW w:type="dxa" w:w="1949"/>
-            <w:vAlign w:val="center"/>
-          </w:tcPr>
-          <w:p>
-            <w:r/>
-            <w:r>
-              <w:rPr>
-                <w:rFonts w:ascii="Calibri" w:hAnsi="Calibri"/>
-                <w:sz w:val="20"/>
-              </w:rPr>
-              <w:t>Enforce HTTPS; consider OAuth2/JWT</w:t>
-            </w:r>
-          </w:p>
-        </w:tc>
-      </w:tr>
-      <w:tr>
-        <w:tc>
-          <w:tcPr>
-            <w:tcW w:type="dxa" w:w="1949"/>
-            <w:vAlign w:val="center"/>
-          </w:tcPr>
-          <w:p>
-            <w:r/>
-            <w:r>
-              <w:rPr>
-                <w:rFonts w:ascii="Calibri" w:hAnsi="Calibri"/>
-                <w:sz w:val="20"/>
-              </w:rPr>
-              <w:t>6</w:t>
-            </w:r>
-          </w:p>
-        </w:tc>
-        <w:tc>
-          <w:tcPr>
-            <w:tcW w:type="dxa" w:w="1949"/>
-            <w:vAlign w:val="center"/>
-          </w:tcPr>
-          <w:p>
-            <w:r/>
-            <w:r>
-              <w:rPr>
-                <w:rFonts w:ascii="Calibri" w:hAnsi="Calibri"/>
-                <w:sz w:val="20"/>
-              </w:rPr>
-              <w:t>Verbose error pages leak internals</w:t>
-            </w:r>
-          </w:p>
-        </w:tc>
-        <w:tc>
-          <w:tcPr>
-            <w:tcW w:type="dxa" w:w="1949"/>
-            <w:vAlign w:val="center"/>
-          </w:tcPr>
-          <w:p>
-            <w:r/>
-            <w:r>
-              <w:rPr>
-                <w:rFonts w:ascii="Calibri" w:hAnsi="Calibri"/>
-                <w:sz w:val="20"/>
-              </w:rPr>
-              <w:t>Medium</w:t>
-            </w:r>
-          </w:p>
-        </w:tc>
-        <w:tc>
-          <w:tcPr>
-            <w:tcW w:type="dxa" w:w="1949"/>
-            <w:vAlign w:val="center"/>
-          </w:tcPr>
-          <w:p>
-            <w:r/>
-            <w:r>
-              <w:rPr>
-                <w:rFonts w:ascii="Calibri" w:hAnsi="Calibri"/>
-                <w:sz w:val="20"/>
-              </w:rPr>
-              <w:t>A05: Misconfiguration</w:t>
-            </w:r>
-          </w:p>
-        </w:tc>
-        <w:tc>
-          <w:tcPr>
-            <w:tcW w:type="dxa" w:w="1949"/>
-            <w:vAlign w:val="center"/>
-          </w:tcPr>
-          <w:p>
-            <w:r/>
-            <w:r>
-              <w:rPr>
-                <w:rFonts w:ascii="Calibri" w:hAnsi="Calibri"/>
-                <w:sz w:val="20"/>
-              </w:rPr>
-              <w:t>Hide stack traces in prod</w:t>
-            </w:r>
-          </w:p>
-        </w:tc>
-      </w:tr>
-      <w:tr>
-        <w:tc>
-          <w:tcPr>
-            <w:tcW w:type="dxa" w:w="1949"/>
-            <w:vAlign w:val="center"/>
-          </w:tcPr>
-          <w:p>
-            <w:r/>
-            <w:r>
-              <w:rPr>
-                <w:rFonts w:ascii="Calibri" w:hAnsi="Calibri"/>
-                <w:sz w:val="20"/>
-              </w:rPr>
-              <w:t>7</w:t>
-            </w:r>
-          </w:p>
-        </w:tc>
-        <w:tc>
-          <w:tcPr>
-            <w:tcW w:type="dxa" w:w="1949"/>
-            <w:vAlign w:val="center"/>
-          </w:tcPr>
-          <w:p>
-            <w:r/>
-            <w:r>
-              <w:rPr>
-                <w:rFonts w:ascii="Calibri" w:hAnsi="Calibri"/>
-                <w:sz w:val="20"/>
-              </w:rPr>
-              <w:t>Outdated Spring Boot 2.7 dependencies</w:t>
-            </w:r>
-          </w:p>
-        </w:tc>
-        <w:tc>
-          <w:tcPr>
-            <w:tcW w:type="dxa" w:w="1949"/>
-            <w:vAlign w:val="center"/>
-          </w:tcPr>
-          <w:p>
-            <w:r/>
-            <w:r>
-              <w:rPr>
-                <w:rFonts w:ascii="Calibri" w:hAnsi="Calibri"/>
-                <w:sz w:val="20"/>
-              </w:rPr>
-              <w:t>Medium</w:t>
-            </w:r>
-          </w:p>
-        </w:tc>
-        <w:tc>
-          <w:tcPr>
-            <w:tcW w:type="dxa" w:w="1949"/>
-            <w:vAlign w:val="center"/>
-          </w:tcPr>
-          <w:p>
-            <w:r/>
-            <w:r>
-              <w:rPr>
-                <w:rFonts w:ascii="Calibri" w:hAnsi="Calibri"/>
-                <w:sz w:val="20"/>
-              </w:rPr>
-              <w:t>A06: Vulnerable Components</w:t>
-            </w:r>
-          </w:p>
-        </w:tc>
-        <w:tc>
-          <w:tcPr>
-            <w:tcW w:type="dxa" w:w="1949"/>
-            <w:vAlign w:val="center"/>
-          </w:tcPr>
-          <w:p>
-            <w:r/>
-            <w:r>
-              <w:rPr>
-                <w:rFonts w:ascii="Calibri" w:hAnsi="Calibri"/>
-                <w:sz w:val="20"/>
-              </w:rPr>
-              <w:t>Upgrade to Spring Boot 3.x</w:t>
-            </w:r>
-          </w:p>
-        </w:tc>
-      </w:tr>
-      <w:tr>
-        <w:tc>
-          <w:tcPr>
-            <w:tcW w:type="dxa" w:w="1949"/>
-            <w:vAlign w:val="center"/>
-          </w:tcPr>
-          <w:p>
-            <w:r/>
-            <w:r>
-              <w:rPr>
-                <w:rFonts w:ascii="Calibri" w:hAnsi="Calibri"/>
-                <w:sz w:val="20"/>
-              </w:rPr>
-              <w:t>8</w:t>
-            </w:r>
-          </w:p>
-        </w:tc>
-        <w:tc>
-          <w:tcPr>
-            <w:tcW w:type="dxa" w:w="1949"/>
-            <w:vAlign w:val="center"/>
-          </w:tcPr>
-          <w:p>
-            <w:r/>
-            <w:r>
-              <w:rPr>
-                <w:rFonts w:ascii="Calibri" w:hAnsi="Calibri"/>
-                <w:sz w:val="20"/>
-              </w:rPr>
-              <w:t>Missing security headers (HSTS, CSP)</w:t>
-            </w:r>
-          </w:p>
-        </w:tc>
-        <w:tc>
-          <w:tcPr>
-            <w:tcW w:type="dxa" w:w="1949"/>
-            <w:vAlign w:val="center"/>
-          </w:tcPr>
-          <w:p>
-            <w:r/>
-            <w:r>
-              <w:rPr>
-                <w:rFonts w:ascii="Calibri" w:hAnsi="Calibri"/>
-                <w:sz w:val="20"/>
-              </w:rPr>
-              <w:t>Medium</w:t>
-            </w:r>
-          </w:p>
-        </w:tc>
-        <w:tc>
-          <w:tcPr>
-            <w:tcW w:type="dxa" w:w="1949"/>
-            <w:vAlign w:val="center"/>
-          </w:tcPr>
-          <w:p>
-            <w:r/>
-            <w:r>
-              <w:rPr>
-                <w:rFonts w:ascii="Calibri" w:hAnsi="Calibri"/>
-                <w:sz w:val="20"/>
-              </w:rPr>
-              <w:t>A05: Misconfiguration</w:t>
-            </w:r>
-          </w:p>
-        </w:tc>
-        <w:tc>
-          <w:tcPr>
-            <w:tcW w:type="dxa" w:w="1949"/>
-            <w:vAlign w:val="center"/>
-          </w:tcPr>
-          <w:p>
-            <w:r/>
-            <w:r>
-              <w:rPr>
-                <w:rFonts w:ascii="Calibri" w:hAnsi="Calibri"/>
-                <w:sz w:val="20"/>
-              </w:rPr>
-              <w:t>Configure `HttpSecurity.headers(...)`</w:t>
-            </w:r>
-          </w:p>
-        </w:tc>
-      </w:tr>
-      <w:tr>
-        <w:tc>
-          <w:tcPr>
-            <w:tcW w:type="dxa" w:w="1949"/>
-            <w:vAlign w:val="center"/>
-          </w:tcPr>
-          <w:p>
-            <w:r/>
-            <w:r>
-              <w:rPr>
-                <w:rFonts w:ascii="Calibri" w:hAnsi="Calibri"/>
-                <w:sz w:val="20"/>
-              </w:rPr>
-              <w:t>9</w:t>
-            </w:r>
-          </w:p>
-        </w:tc>
-        <w:tc>
-          <w:tcPr>
-            <w:tcW w:type="dxa" w:w="1949"/>
-            <w:vAlign w:val="center"/>
-          </w:tcPr>
-          <w:p>
-            <w:r/>
-            <w:r>
-              <w:rPr>
-                <w:rFonts w:ascii="Calibri" w:hAnsi="Calibri"/>
-                <w:sz w:val="20"/>
-              </w:rPr>
-              <w:t>No rate limiting on auth endpoints</w:t>
-            </w:r>
-          </w:p>
-        </w:tc>
-        <w:tc>
-          <w:tcPr>
-            <w:tcW w:type="dxa" w:w="1949"/>
-            <w:vAlign w:val="center"/>
-          </w:tcPr>
-          <w:p>
-            <w:r/>
-            <w:r>
-              <w:rPr>
-                <w:rFonts w:ascii="Calibri" w:hAnsi="Calibri"/>
-                <w:sz w:val="20"/>
-              </w:rPr>
-              <w:t>Medium</w:t>
-            </w:r>
-          </w:p>
-        </w:tc>
-        <w:tc>
-          <w:tcPr>
-            <w:tcW w:type="dxa" w:w="1949"/>
-            <w:vAlign w:val="center"/>
-          </w:tcPr>
-          <w:p>
-            <w:r/>
-            <w:r>
-              <w:rPr>
-                <w:rFonts w:ascii="Calibri" w:hAnsi="Calibri"/>
-                <w:sz w:val="20"/>
-              </w:rPr>
-              <w:t>A07: Auth Failures</w:t>
-            </w:r>
-          </w:p>
-        </w:tc>
-        <w:tc>
-          <w:tcPr>
-            <w:tcW w:type="dxa" w:w="1949"/>
-            <w:vAlign w:val="center"/>
-          </w:tcPr>
-          <w:p>
-            <w:r/>
-            <w:r>
-              <w:rPr>
-                <w:rFonts w:ascii="Calibri" w:hAnsi="Calibri"/>
-                <w:sz w:val="20"/>
-              </w:rPr>
-              <w:t>Add bucket4j / gateway rate limiter</w:t>
-            </w:r>
-          </w:p>
-        </w:tc>
-      </w:tr>
-      <w:tr>
-        <w:tc>
-          <w:tcPr>
-            <w:tcW w:type="dxa" w:w="1949"/>
-            <w:vAlign w:val="center"/>
-          </w:tcPr>
-          <w:p>
-            <w:r/>
-            <w:r>
-              <w:rPr>
-                <w:rFonts w:ascii="Calibri" w:hAnsi="Calibri"/>
-                <w:sz w:val="20"/>
-              </w:rPr>
-              <w:t>10</w:t>
-            </w:r>
-          </w:p>
-        </w:tc>
-        <w:tc>
-          <w:tcPr>
-            <w:tcW w:type="dxa" w:w="1949"/>
-            <w:vAlign w:val="center"/>
-          </w:tcPr>
-          <w:p>
-            <w:r/>
-            <w:r>
-              <w:rPr>
-                <w:rFonts w:ascii="Calibri" w:hAnsi="Calibri"/>
-                <w:sz w:val="20"/>
-              </w:rPr>
-              <w:t>Insufficient logging &amp; monitoring</w:t>
-            </w:r>
-          </w:p>
-        </w:tc>
-        <w:tc>
-          <w:tcPr>
-            <w:tcW w:type="dxa" w:w="1949"/>
-            <w:vAlign w:val="center"/>
-          </w:tcPr>
-          <w:p>
-            <w:r/>
-            <w:r>
-              <w:rPr>
-                <w:rFonts w:ascii="Calibri" w:hAnsi="Calibri"/>
-                <w:sz w:val="20"/>
-              </w:rPr>
-              <w:t>Low</w:t>
-            </w:r>
-          </w:p>
-        </w:tc>
-        <w:tc>
-          <w:tcPr>
-            <w:tcW w:type="dxa" w:w="1949"/>
-            <w:vAlign w:val="center"/>
-          </w:tcPr>
-          <w:p>
-            <w:r/>
-            <w:r>
-              <w:rPr>
-                <w:rFonts w:ascii="Calibri" w:hAnsi="Calibri"/>
-                <w:sz w:val="20"/>
-              </w:rPr>
-              <w:t>A09: Logging Failures</w:t>
-            </w:r>
-          </w:p>
-        </w:tc>
-        <w:tc>
-          <w:tcPr>
-            <w:tcW w:type="dxa" w:w="1949"/>
-            <w:vAlign w:val="center"/>
-          </w:tcPr>
-          <w:p>
-            <w:r/>
-            <w:r>
-              <w:rPr>
-                <w:rFonts w:ascii="Calibri" w:hAnsi="Calibri"/>
-                <w:sz w:val="20"/>
-              </w:rPr>
-              <w:t>Structured audit logs for auth events</w:t>
-            </w:r>
-          </w:p>
-        </w:tc>
-      </w:tr>
-      <w:tr>
-        <w:tc>
-          <w:tcPr>
-            <w:tcW w:type="dxa" w:w="1949"/>
-            <w:vAlign w:val="center"/>
-          </w:tcPr>
-          <w:p>
-            <w:r/>
-            <w:r>
-              <w:rPr>
-                <w:rFonts w:ascii="Calibri" w:hAnsi="Calibri"/>
-                <w:sz w:val="20"/>
-              </w:rPr>
-              <w:t>11</w:t>
-            </w:r>
-          </w:p>
-        </w:tc>
-        <w:tc>
-          <w:tcPr>
-            <w:tcW w:type="dxa" w:w="1949"/>
-            <w:vAlign w:val="center"/>
-          </w:tcPr>
-          <w:p>
-            <w:r/>
-            <w:r>
-              <w:rPr>
-                <w:rFonts w:ascii="Calibri" w:hAnsi="Calibri"/>
-                <w:sz w:val="20"/>
-              </w:rPr>
-              <w:t>Supply-chain risk (unpinned transitive deps)</w:t>
-            </w:r>
-          </w:p>
-        </w:tc>
-        <w:tc>
-          <w:tcPr>
-            <w:tcW w:type="dxa" w:w="1949"/>
-            <w:vAlign w:val="center"/>
-          </w:tcPr>
-          <w:p>
-            <w:r/>
-            <w:r>
-              <w:rPr>
-                <w:rFonts w:ascii="Calibri" w:hAnsi="Calibri"/>
-                <w:sz w:val="20"/>
-              </w:rPr>
-              <w:t>Low</w:t>
-            </w:r>
-          </w:p>
-        </w:tc>
-        <w:tc>
-          <w:tcPr>
-            <w:tcW w:type="dxa" w:w="1949"/>
-            <w:vAlign w:val="center"/>
-          </w:tcPr>
-          <w:p>
-            <w:r/>
-            <w:r>
-              <w:rPr>
-                <w:rFonts w:ascii="Calibri" w:hAnsi="Calibri"/>
-                <w:sz w:val="20"/>
-              </w:rPr>
-              <w:t>A08: Integrity Failures</w:t>
-            </w:r>
-          </w:p>
-        </w:tc>
-        <w:tc>
-          <w:tcPr>
-            <w:tcW w:type="dxa" w:w="1949"/>
-            <w:vAlign w:val="center"/>
-          </w:tcPr>
-          <w:p>
-            <w:r/>
-            <w:r>
-              <w:rPr>
-                <w:rFonts w:ascii="Calibri" w:hAnsi="Calibri"/>
-                <w:sz w:val="20"/>
-              </w:rPr>
-              <w:t>Dependency review + SBOM</w:t>
-            </w:r>
-          </w:p>
-        </w:tc>
-      </w:tr>
-    </w:tbl>
-    <w:p/>
-    <w:p>
       <w:r>
         <w:br w:type="page"/>
       </w:r>
@@ -2447,10 +622,6 @@
         <w:pStyle w:val="Heading1"/>
       </w:pPr>
       <w:r>
-        <w:rPr>
-          <w:rFonts w:ascii="Calibri" w:hAnsi="Calibri"/>
-          <w:color w:val="1F3A68"/>
-        </w:rPr>
         <w:t>SCENE 6 — The Migration Plan (3 min)</w:t>
       </w:r>
     </w:p>
@@ -2462,8 +633,9 @@
         <w:rPr>
           <w:rFonts w:ascii="Calibri" w:hAnsi="Calibri"/>
           <w:b/>
+          <w:sz w:val="22"/>
         </w:rPr>
-        <w:t>[ACTION: Type "create a phased plan to migration to java 17"]</w:t>
+        <w:t>[ACTION: Type “create a phased plan to migration to java 17”]</w:t>
       </w:r>
     </w:p>
     <w:p>
@@ -2474,18 +646,15 @@
         <w:rPr>
           <w:rFonts w:ascii="Calibri" w:hAnsi="Calibri"/>
           <w:b/>
+          <w:sz w:val="22"/>
         </w:rPr>
         <w:t>Speaker script:</w:t>
       </w:r>
     </w:p>
     <w:p>
       <w:pPr>
-        <w:spacing w:before="0" w:after="120"/>
-        <w:ind w:left="454" w:right="227"/>
-        <w:pBdr>
-          <w:left w:val="single" w:sz="18" w:space="8" w:color="1F3A68"/>
-        </w:pBdr>
-        <w:shd w:val="clear" w:color="auto" w:fill="F4F6FA"/>
+        <w:spacing w:after="120"/>
+        <w:ind w:left="432"/>
       </w:pPr>
       <w:r>
         <w:rPr>
@@ -2497,12 +666,8 @@
     </w:p>
     <w:p>
       <w:pPr>
-        <w:spacing w:before="0" w:after="120"/>
-        <w:ind w:left="454" w:right="227"/>
-        <w:pBdr>
-          <w:left w:val="single" w:sz="18" w:space="8" w:color="1F3A68"/>
-        </w:pBdr>
-        <w:shd w:val="clear" w:color="auto" w:fill="F4F6FA"/>
+        <w:spacing w:after="120"/>
+        <w:ind w:left="432"/>
       </w:pPr>
       <w:r>
         <w:rPr>
@@ -2514,12 +679,8 @@
     </w:p>
     <w:p>
       <w:pPr>
-        <w:spacing w:before="0" w:after="120"/>
-        <w:ind w:left="454" w:right="227"/>
-        <w:pBdr>
-          <w:left w:val="single" w:sz="18" w:space="8" w:color="1F3A68"/>
-        </w:pBdr>
-        <w:shd w:val="clear" w:color="auto" w:fill="F4F6FA"/>
+        <w:spacing w:after="120"/>
+        <w:ind w:left="432"/>
       </w:pPr>
       <w:r>
         <w:rPr>
@@ -2527,24 +688,20 @@
           <w:b/>
           <w:sz w:val="22"/>
         </w:rPr>
-        <w:t>Phase 1 — Prepare the Ground:</w:t>
+        <w:t xml:space="preserve">Phase 1 — Prepare the Ground: </w:t>
       </w:r>
       <w:r>
         <w:rPr>
           <w:rFonts w:ascii="Calibri" w:hAnsi="Calibri"/>
           <w:sz w:val="22"/>
         </w:rPr>
-        <w:t xml:space="preserve"> Bump Lombok to 1.18.34, bump MapStruct to 1.5.5, migrate the JUnit 4 test to JUnit 5, and rewrite the security config to drop `WebSecurityConfigurerAdapter`. All of this can be done while still on Java 11 and Spring Boot 2.7 — zero risk.</w:t>
+        <w:t>Bump Lombok to 1.18.34, bump MapStruct to 1.5.5, migrate the JUnit 4 test to JUnit 5, and rewrite the security config to drop WebSecurityConfigurerAdapter. All of this can be done while still on Java 11 and Spring Boot 2.7 — zero risk.</w:t>
       </w:r>
     </w:p>
     <w:p>
       <w:pPr>
-        <w:spacing w:before="0" w:after="120"/>
-        <w:ind w:left="454" w:right="227"/>
-        <w:pBdr>
-          <w:left w:val="single" w:sz="18" w:space="8" w:color="1F3A68"/>
-        </w:pBdr>
-        <w:shd w:val="clear" w:color="auto" w:fill="F4F6FA"/>
+        <w:spacing w:after="120"/>
+        <w:ind w:left="432"/>
       </w:pPr>
       <w:r>
         <w:rPr>
@@ -2552,24 +709,20 @@
           <w:b/>
           <w:sz w:val="22"/>
         </w:rPr>
-        <w:t>Phase 2 — Switch to Java 17:</w:t>
+        <w:t xml:space="preserve">Phase 2 — Switch to Java 17: </w:t>
       </w:r>
       <w:r>
         <w:rPr>
           <w:rFonts w:ascii="Calibri" w:hAnsi="Calibri"/>
           <w:sz w:val="22"/>
         </w:rPr>
-        <w:t xml:space="preserve"> Update `pom.xml` properties and the CI workflow. With Phase 1 done, this should compile and pass all tests immediately.</w:t>
+        <w:t>Update pom.xml properties and the CI workflow. With Phase 1 done, this should compile and pass all tests immediately.</w:t>
       </w:r>
     </w:p>
     <w:p>
       <w:pPr>
-        <w:spacing w:before="0" w:after="120"/>
-        <w:ind w:left="454" w:right="227"/>
-        <w:pBdr>
-          <w:left w:val="single" w:sz="18" w:space="8" w:color="1F3A68"/>
-        </w:pBdr>
-        <w:shd w:val="clear" w:color="auto" w:fill="F4F6FA"/>
+        <w:spacing w:after="120"/>
+        <w:ind w:left="432"/>
       </w:pPr>
       <w:r>
         <w:rPr>
@@ -2577,24 +730,20 @@
           <w:b/>
           <w:sz w:val="22"/>
         </w:rPr>
-        <w:t>Phase 3 — Upgrade to Spring Boot 3.x:</w:t>
+        <w:t xml:space="preserve">Phase 3 — Upgrade to Spring Boot 3.x: </w:t>
       </w:r>
       <w:r>
         <w:rPr>
           <w:rFonts w:ascii="Calibri" w:hAnsi="Calibri"/>
           <w:sz w:val="22"/>
         </w:rPr>
-        <w:t xml:space="preserve"> Bump the parent POM, migrate all `javax.*` imports to `jakarta.*`, and update the Security API. This is the riskiest phase, but because we decoupled everything else in Phases 1 and 2, it only has to deal with the namespace migration.</w:t>
+        <w:t>Bump the parent POM, migrate all javax.* imports to jakarta.*, and update the Security API. This is the riskiest phase, but because we decoupled everything else in Phases 1 and 2, it only has to deal with the namespace migration.</w:t>
       </w:r>
     </w:p>
     <w:p>
       <w:pPr>
-        <w:spacing w:before="0" w:after="120"/>
-        <w:ind w:left="454" w:right="227"/>
-        <w:pBdr>
-          <w:left w:val="single" w:sz="18" w:space="8" w:color="1F3A68"/>
-        </w:pBdr>
-        <w:shd w:val="clear" w:color="auto" w:fill="F4F6FA"/>
+        <w:spacing w:after="120"/>
+        <w:ind w:left="432"/>
       </w:pPr>
       <w:r>
         <w:rPr>
@@ -2602,24 +751,20 @@
           <w:b/>
           <w:sz w:val="22"/>
         </w:rPr>
-        <w:t>Phase 4 — Cleanup:</w:t>
+        <w:t xml:space="preserve">Phase 4 — Cleanup: </w:t>
       </w:r>
       <w:r>
         <w:rPr>
           <w:rFonts w:ascii="Calibri" w:hAnsi="Calibri"/>
           <w:sz w:val="22"/>
         </w:rPr>
-        <w:t xml:space="preserve"> Remove leftover dependencies, audit deprecations, update documentation.</w:t>
+        <w:t>Remove leftover dependencies, audit deprecations, update documentation.</w:t>
       </w:r>
     </w:p>
     <w:p>
       <w:pPr>
-        <w:spacing w:before="0" w:after="120"/>
-        <w:ind w:left="454" w:right="227"/>
-        <w:pBdr>
-          <w:left w:val="single" w:sz="18" w:space="8" w:color="1F3A68"/>
-        </w:pBdr>
-        <w:shd w:val="clear" w:color="auto" w:fill="F4F6FA"/>
+        <w:spacing w:after="120"/>
+        <w:ind w:left="432"/>
       </w:pPr>
       <w:r>
         <w:rPr>
@@ -2639,10 +784,6 @@
         <w:pStyle w:val="Heading1"/>
       </w:pPr>
       <w:r>
-        <w:rPr>
-          <w:rFonts w:ascii="Calibri" w:hAnsi="Calibri"/>
-          <w:color w:val="1F3A68"/>
-        </w:rPr>
         <w:t>SCENE 7 — Execution: Tech Lead Devin + 4 Child Devins (5 min)</w:t>
       </w:r>
     </w:p>
@@ -2654,8 +795,9 @@
         <w:rPr>
           <w:rFonts w:ascii="Calibri" w:hAnsi="Calibri"/>
           <w:b/>
+          <w:sz w:val="22"/>
         </w:rPr>
-        <w:t>[ACTION: Create a new Devin session with the prompt: "Upgrade this project from Java 11 + Spring Boot 2.7 to Java 17 + Spring Boot 3. Open a PR with all the required changes and make sure CI passes."]</w:t>
+        <w:t>[ACTION: Create a new Devin session with the prompt: “Upgrade this project from Java 11 + Spring Boot 2.7 to Java 17 + Spring Boot 3. Open a PR with all the required changes and make sure CI passes.”]</w:t>
       </w:r>
     </w:p>
     <w:p>
@@ -2666,82 +808,41 @@
         <w:rPr>
           <w:rFonts w:ascii="Calibri" w:hAnsi="Calibri"/>
           <w:b/>
+          <w:sz w:val="22"/>
         </w:rPr>
         <w:t>Speaker script:</w:t>
       </w:r>
     </w:p>
     <w:p>
       <w:pPr>
-        <w:spacing w:before="0" w:after="120"/>
-        <w:ind w:left="454" w:right="227"/>
-        <w:pBdr>
-          <w:left w:val="single" w:sz="18" w:space="8" w:color="1F3A68"/>
-        </w:pBdr>
-        <w:shd w:val="clear" w:color="auto" w:fill="F4F6FA"/>
+        <w:spacing w:after="120"/>
+        <w:ind w:left="432"/>
       </w:pPr>
       <w:r>
         <w:rPr>
           <w:rFonts w:ascii="Calibri" w:hAnsi="Calibri"/>
           <w:sz w:val="22"/>
         </w:rPr>
-        <w:t xml:space="preserve">Now we move from planning to execution. I'm going to create a </w:t>
-      </w:r>
-      <w:r>
-        <w:rPr>
-          <w:rFonts w:ascii="Calibri" w:hAnsi="Calibri"/>
-          <w:b/>
-          <w:sz w:val="22"/>
-        </w:rPr>
-        <w:t>Tech Lead Devin</w:t>
-      </w:r>
-      <w:r>
-        <w:rPr>
-          <w:rFonts w:ascii="Calibri" w:hAnsi="Calibri"/>
-          <w:sz w:val="22"/>
-        </w:rPr>
-        <w:t xml:space="preserve"> with a single prompt: "Upgrade this project from Java 11 + Spring Boot 2.7 to Java 17 + Spring Boot 3. Open a PR with all the required changes and make sure CI passes."</w:t>
+        <w:t>Now we move from planning to execution. I'm going to create a Tech Lead Devin with a single prompt: “Upgrade this project from Java 11 + Spring Boot 2.7 to Java 17 + Spring Boot 3. Open a PR with all the required changes and make sure CI passes.”</w:t>
       </w:r>
     </w:p>
     <w:p>
       <w:pPr>
-        <w:spacing w:before="0" w:after="120"/>
-        <w:ind w:left="454" w:right="227"/>
-        <w:pBdr>
-          <w:left w:val="single" w:sz="18" w:space="8" w:color="1F3A68"/>
-        </w:pBdr>
-        <w:shd w:val="clear" w:color="auto" w:fill="F4F6FA"/>
+        <w:spacing w:after="120"/>
+        <w:ind w:left="432"/>
       </w:pPr>
       <w:r>
         <w:rPr>
           <w:rFonts w:ascii="Calibri" w:hAnsi="Calibri"/>
           <w:sz w:val="22"/>
         </w:rPr>
-        <w:t xml:space="preserve">Watch what happens. The Tech Lead Devin analyzes the codebase, creates the migration plan, and then spawns </w:t>
-      </w:r>
-      <w:r>
-        <w:rPr>
-          <w:rFonts w:ascii="Calibri" w:hAnsi="Calibri"/>
-          <w:b/>
-          <w:sz w:val="22"/>
-        </w:rPr>
-        <w:t>4 Child Devins</w:t>
-      </w:r>
-      <w:r>
-        <w:rPr>
-          <w:rFonts w:ascii="Calibri" w:hAnsi="Calibri"/>
-          <w:sz w:val="22"/>
-        </w:rPr>
-        <w:t xml:space="preserve"> — each one working on a specific part of the upgrade in parallel:</w:t>
+        <w:t>Watch what happens. The Tech Lead Devin analyzes the codebase, creates the migration plan, and then spawns 4 Child Devins — each one working on a specific part of the upgrade in parallel:</w:t>
       </w:r>
     </w:p>
     <w:p>
       <w:pPr>
-        <w:spacing w:before="0" w:after="120"/>
-        <w:ind w:left="454" w:right="227"/>
-        <w:pBdr>
-          <w:left w:val="single" w:sz="18" w:space="8" w:color="1F3A68"/>
-        </w:pBdr>
-        <w:shd w:val="clear" w:color="auto" w:fill="F4F6FA"/>
+        <w:spacing w:after="120"/>
+        <w:ind w:left="432"/>
       </w:pPr>
       <w:r>
         <w:rPr>
@@ -2749,24 +850,20 @@
           <w:b/>
           <w:sz w:val="22"/>
         </w:rPr>
-        <w:t>Child Devin 1 — Dependencies &amp; Build:</w:t>
+        <w:t xml:space="preserve">Child Devin 1 — Dependencies &amp; Build: </w:t>
       </w:r>
       <w:r>
         <w:rPr>
           <w:rFonts w:ascii="Calibri" w:hAnsi="Calibri"/>
           <w:sz w:val="22"/>
         </w:rPr>
-        <w:t xml:space="preserve"> Updates `pom.xml` — bumps the Spring Boot parent to 3.x, sets Java version to 17, upgrades Lombok and MapStruct, removes the JUnit 4 dependency, adds `lombok-mapstruct-binding`.</w:t>
+        <w:t>Updates pom.xml — bumps the Spring Boot parent to 3.x, sets Java version to 17, upgrades Lombok and MapStruct, removes the JUnit 4 dependency, adds lombok-mapstruct-binding.</w:t>
       </w:r>
     </w:p>
     <w:p>
       <w:pPr>
-        <w:spacing w:before="0" w:after="120"/>
-        <w:ind w:left="454" w:right="227"/>
-        <w:pBdr>
-          <w:left w:val="single" w:sz="18" w:space="8" w:color="1F3A68"/>
-        </w:pBdr>
-        <w:shd w:val="clear" w:color="auto" w:fill="F4F6FA"/>
+        <w:spacing w:after="120"/>
+        <w:ind w:left="432"/>
       </w:pPr>
       <w:r>
         <w:rPr>
@@ -2774,24 +871,20 @@
           <w:b/>
           <w:sz w:val="22"/>
         </w:rPr>
-        <w:t>Child Devin 2 — Namespace Migration:</w:t>
+        <w:t xml:space="preserve">Child Devin 2 — Namespace Migration: </w:t>
       </w:r>
       <w:r>
         <w:rPr>
           <w:rFonts w:ascii="Calibri" w:hAnsi="Calibri"/>
           <w:sz w:val="22"/>
         </w:rPr>
-        <w:t xml:space="preserve"> Performs the `javax.*` to `jakarta.*` migration across all Java source files — `User.java`, `UserDto.java`, `UserController.java`, `GreetingController.java`.</w:t>
+        <w:t>Performs the javax.* to jakarta.* migration across all Java source files — User.java, UserDto.java, UserController.java, GreetingController.java.</w:t>
       </w:r>
     </w:p>
     <w:p>
       <w:pPr>
-        <w:spacing w:before="0" w:after="120"/>
-        <w:ind w:left="454" w:right="227"/>
-        <w:pBdr>
-          <w:left w:val="single" w:sz="18" w:space="8" w:color="1F3A68"/>
-        </w:pBdr>
-        <w:shd w:val="clear" w:color="auto" w:fill="F4F6FA"/>
+        <w:spacing w:after="120"/>
+        <w:ind w:left="432"/>
       </w:pPr>
       <w:r>
         <w:rPr>
@@ -2799,24 +892,20 @@
           <w:b/>
           <w:sz w:val="22"/>
         </w:rPr>
-        <w:t>Child Devin 3 — Security &amp; Configuration:</w:t>
+        <w:t xml:space="preserve">Child Devin 3 — Security &amp; Configuration: </w:t>
       </w:r>
       <w:r>
         <w:rPr>
           <w:rFonts w:ascii="Calibri" w:hAnsi="Calibri"/>
           <w:sz w:val="22"/>
         </w:rPr>
-        <w:t xml:space="preserve"> Rewrites `SecurityConfig.java` to use the new component-based `SecurityFilterChain` pattern, removes the `WebSecurityConfigurerAdapter` inheritance, updates the API from `antMatchers` to `requestMatchers`.</w:t>
+        <w:t>Rewrites SecurityConfig.java to use the new component-based SecurityFilterChain pattern, removes the WebSecurityConfigurerAdapter inheritance, updates the API from antMatchers to requestMatchers.</w:t>
       </w:r>
     </w:p>
     <w:p>
       <w:pPr>
-        <w:spacing w:before="0" w:after="120"/>
-        <w:ind w:left="454" w:right="227"/>
-        <w:pBdr>
-          <w:left w:val="single" w:sz="18" w:space="8" w:color="1F3A68"/>
-        </w:pBdr>
-        <w:shd w:val="clear" w:color="auto" w:fill="F4F6FA"/>
+        <w:spacing w:after="120"/>
+        <w:ind w:left="432"/>
       </w:pPr>
       <w:r>
         <w:rPr>
@@ -2824,24 +913,20 @@
           <w:b/>
           <w:sz w:val="22"/>
         </w:rPr>
-        <w:t>Child Devin 4 — Tests &amp; CI:</w:t>
+        <w:t xml:space="preserve">Child Devin 4 — Tests &amp; CI: </w:t>
       </w:r>
       <w:r>
         <w:rPr>
           <w:rFonts w:ascii="Calibri" w:hAnsi="Calibri"/>
           <w:sz w:val="22"/>
         </w:rPr>
-        <w:t xml:space="preserve"> Migrates `LegacyJunit4Test.java` from JUnit 4 to JUnit 5, updates the GitHub Actions workflow from `actions/setup-java@v2` with Java 11 to `actions/setup-java@v4` with Java 17, and verifies all tests pass.</w:t>
+        <w:t>Migrates LegacyJunit4Test.java from JUnit 4 to JUnit 5, updates the GitHub Actions workflow from actions/setup-java@v2 with Java 11 to actions/setup-java@v4 with Java 17, and verifies all tests pass.</w:t>
       </w:r>
     </w:p>
     <w:p>
       <w:pPr>
-        <w:spacing w:before="0" w:after="120"/>
-        <w:ind w:left="454" w:right="227"/>
-        <w:pBdr>
-          <w:left w:val="single" w:sz="18" w:space="8" w:color="1F3A68"/>
-        </w:pBdr>
-        <w:shd w:val="clear" w:color="auto" w:fill="F4F6FA"/>
+        <w:spacing w:after="120"/>
+        <w:ind w:left="432"/>
       </w:pPr>
       <w:r>
         <w:rPr>
@@ -2859,47 +944,28 @@
         <w:rPr>
           <w:rFonts w:ascii="Calibri" w:hAnsi="Calibri"/>
           <w:b/>
+          <w:sz w:val="22"/>
         </w:rPr>
         <w:t>[ACTION: Show the PR being created on GitHub with all the changes]</w:t>
       </w:r>
     </w:p>
     <w:p>
       <w:pPr>
-        <w:spacing w:before="120" w:after="40"/>
-      </w:pPr>
-      <w:r>
-        <w:rPr>
-          <w:rFonts w:ascii="Calibri" w:hAnsi="Calibri"/>
-          <w:b/>
-        </w:rPr>
-        <w:t>Speaker script:</w:t>
-      </w:r>
-    </w:p>
-    <w:p>
-      <w:pPr>
-        <w:spacing w:before="0" w:after="120"/>
-        <w:ind w:left="454" w:right="227"/>
-        <w:pBdr>
-          <w:left w:val="single" w:sz="18" w:space="8" w:color="1F3A68"/>
-        </w:pBdr>
-        <w:shd w:val="clear" w:color="auto" w:fill="F4F6FA"/>
+        <w:spacing w:after="120"/>
+        <w:ind w:left="432"/>
       </w:pPr>
       <w:r>
         <w:rPr>
           <w:rFonts w:ascii="Calibri" w:hAnsi="Calibri"/>
           <w:sz w:val="22"/>
         </w:rPr>
-        <w:t>And here it is — a clean Pull Request with all the upgrade changes, organized by commit. CI is green. Every `javax` import is now `jakarta`. The security config uses the modern pattern. Tests are all JUnit 5. The build runs on Java 17.</w:t>
+        <w:t>And here it is — a clean Pull Request with all the upgrade changes, organized by commit. CI is green. Every javax import is now jakarta. The security config uses the modern pattern. Tests are all JUnit 5. The build runs on Java 17.</w:t>
       </w:r>
     </w:p>
     <w:p>
       <w:pPr>
-        <w:spacing w:before="0" w:after="120"/>
-        <w:ind w:left="454" w:right="227"/>
-        <w:pBdr>
-          <w:left w:val="single" w:sz="18" w:space="8" w:color="1F3A68"/>
-        </w:pBdr>
-        <w:shd w:val="clear" w:color="auto" w:fill="F4F6FA"/>
+        <w:spacing w:after="120"/>
+        <w:ind w:left="432"/>
       </w:pPr>
       <w:r>
         <w:rPr>
@@ -2919,10 +985,6 @@
         <w:pStyle w:val="Heading1"/>
       </w:pPr>
       <w:r>
-        <w:rPr>
-          <w:rFonts w:ascii="Calibri" w:hAnsi="Calibri"/>
-          <w:color w:val="1F3A68"/>
-        </w:rPr>
         <w:t>SCENE 8 — Closing (1 min)</w:t>
       </w:r>
     </w:p>
@@ -2934,18 +996,15 @@
         <w:rPr>
           <w:rFonts w:ascii="Calibri" w:hAnsi="Calibri"/>
           <w:b/>
+          <w:sz w:val="22"/>
         </w:rPr>
         <w:t>Speaker script:</w:t>
       </w:r>
     </w:p>
     <w:p>
       <w:pPr>
-        <w:spacing w:before="0" w:after="120"/>
-        <w:ind w:left="454" w:right="227"/>
-        <w:pBdr>
-          <w:left w:val="single" w:sz="18" w:space="8" w:color="1F3A68"/>
-        </w:pBdr>
-        <w:shd w:val="clear" w:color="auto" w:fill="F4F6FA"/>
+        <w:spacing w:after="120"/>
+        <w:ind w:left="432"/>
       </w:pPr>
       <w:r>
         <w:rPr>
@@ -2957,204 +1016,86 @@
     </w:p>
     <w:p>
       <w:pPr>
-        <w:spacing w:before="0" w:after="120"/>
-        <w:ind w:left="454" w:right="227"/>
-        <w:pBdr>
-          <w:left w:val="single" w:sz="18" w:space="8" w:color="1F3A68"/>
-        </w:pBdr>
-        <w:shd w:val="clear" w:color="auto" w:fill="F4F6FA"/>
+        <w:pStyle w:val="ListNumber"/>
+        <w:spacing w:after="80"/>
       </w:pPr>
       <w:r>
         <w:rPr>
           <w:rFonts w:ascii="Calibri" w:hAnsi="Calibri"/>
           <w:sz w:val="22"/>
         </w:rPr>
-        <w:t xml:space="preserve">1. </w:t>
-      </w:r>
-      <w:r>
-        <w:rPr>
-          <w:rFonts w:ascii="Calibri" w:hAnsi="Calibri"/>
-          <w:b/>
-          <w:sz w:val="22"/>
-        </w:rPr>
-        <w:t>Devin Wiki</w:t>
-      </w:r>
-      <w:r>
-        <w:rPr>
-          <w:rFonts w:ascii="Calibri" w:hAnsi="Calibri"/>
-          <w:sz w:val="22"/>
-        </w:rPr>
-        <w:t xml:space="preserve"> gave us instant architectural understanding of an unfamiliar codebase.</w:t>
+        <w:t>Devin Wiki gave us instant architectural understanding of an unfamiliar codebase.</w:t>
       </w:r>
     </w:p>
     <w:p>
       <w:pPr>
-        <w:spacing w:before="0" w:after="120"/>
-        <w:ind w:left="454" w:right="227"/>
-        <w:pBdr>
-          <w:left w:val="single" w:sz="18" w:space="8" w:color="1F3A68"/>
-        </w:pBdr>
-        <w:shd w:val="clear" w:color="auto" w:fill="F4F6FA"/>
+        <w:pStyle w:val="ListNumber"/>
+        <w:spacing w:after="80"/>
       </w:pPr>
       <w:r>
         <w:rPr>
           <w:rFonts w:ascii="Calibri" w:hAnsi="Calibri"/>
           <w:sz w:val="22"/>
         </w:rPr>
-        <w:t xml:space="preserve">2. </w:t>
-      </w:r>
-      <w:r>
-        <w:rPr>
-          <w:rFonts w:ascii="Calibri" w:hAnsi="Calibri"/>
-          <w:b/>
-          <w:sz w:val="22"/>
-        </w:rPr>
-        <w:t>Codebase Q&amp;A</w:t>
-      </w:r>
-      <w:r>
-        <w:rPr>
-          <w:rFonts w:ascii="Calibri" w:hAnsi="Calibri"/>
-          <w:sz w:val="22"/>
-        </w:rPr>
-        <w:t xml:space="preserve"> let us explore the project interactively, like talking to a senior developer who already read every file.</w:t>
+        <w:t>Codebase Q&amp;A let us explore the project interactively, like talking to a senior developer who already read every file.</w:t>
       </w:r>
     </w:p>
     <w:p>
       <w:pPr>
-        <w:spacing w:before="0" w:after="120"/>
-        <w:ind w:left="454" w:right="227"/>
-        <w:pBdr>
-          <w:left w:val="single" w:sz="18" w:space="8" w:color="1F3A68"/>
-        </w:pBdr>
-        <w:shd w:val="clear" w:color="auto" w:fill="F4F6FA"/>
+        <w:pStyle w:val="ListNumber"/>
+        <w:spacing w:after="80"/>
       </w:pPr>
       <w:r>
         <w:rPr>
           <w:rFonts w:ascii="Calibri" w:hAnsi="Calibri"/>
           <w:sz w:val="22"/>
         </w:rPr>
-        <w:t xml:space="preserve">3. </w:t>
-      </w:r>
-      <w:r>
-        <w:rPr>
-          <w:rFonts w:ascii="Calibri" w:hAnsi="Calibri"/>
-          <w:b/>
-          <w:sz w:val="22"/>
-        </w:rPr>
-        <w:t>Bug detection</w:t>
-      </w:r>
-      <w:r>
-        <w:rPr>
-          <w:rFonts w:ascii="Calibri" w:hAnsi="Calibri"/>
-          <w:sz w:val="22"/>
-        </w:rPr>
-        <w:t xml:space="preserve"> found 7 real issues including a mass assignment vulnerability and broken JPA equals/hashCode.</w:t>
+        <w:t>Bug detection found 7 real issues including a mass assignment vulnerability and broken JPA equals/hashCode.</w:t>
       </w:r>
     </w:p>
     <w:p>
       <w:pPr>
-        <w:spacing w:before="0" w:after="120"/>
-        <w:ind w:left="454" w:right="227"/>
-        <w:pBdr>
-          <w:left w:val="single" w:sz="18" w:space="8" w:color="1F3A68"/>
-        </w:pBdr>
-        <w:shd w:val="clear" w:color="auto" w:fill="F4F6FA"/>
+        <w:pStyle w:val="ListNumber"/>
+        <w:spacing w:after="80"/>
       </w:pPr>
       <w:r>
         <w:rPr>
           <w:rFonts w:ascii="Calibri" w:hAnsi="Calibri"/>
           <w:sz w:val="22"/>
         </w:rPr>
-        <w:t xml:space="preserve">4. </w:t>
-      </w:r>
-      <w:r>
-        <w:rPr>
-          <w:rFonts w:ascii="Calibri" w:hAnsi="Calibri"/>
-          <w:b/>
-          <w:sz w:val="22"/>
-        </w:rPr>
-        <w:t>Security audit</w:t>
-      </w:r>
-      <w:r>
-        <w:rPr>
-          <w:rFonts w:ascii="Calibri" w:hAnsi="Calibri"/>
-          <w:sz w:val="22"/>
-        </w:rPr>
-        <w:t xml:space="preserve"> identified 11 vulnerabilities mapped to OWASP categories, from Critical CSRF issues to supply chain risks.</w:t>
+        <w:t>Security audit identified 11 vulnerabilities mapped to OWASP categories, from Critical CSRF issues to supply chain risks.</w:t>
       </w:r>
     </w:p>
     <w:p>
       <w:pPr>
-        <w:spacing w:before="0" w:after="120"/>
-        <w:ind w:left="454" w:right="227"/>
-        <w:pBdr>
-          <w:left w:val="single" w:sz="18" w:space="8" w:color="1F3A68"/>
-        </w:pBdr>
-        <w:shd w:val="clear" w:color="auto" w:fill="F4F6FA"/>
+        <w:pStyle w:val="ListNumber"/>
+        <w:spacing w:after="80"/>
       </w:pPr>
       <w:r>
         <w:rPr>
           <w:rFonts w:ascii="Calibri" w:hAnsi="Calibri"/>
           <w:sz w:val="22"/>
         </w:rPr>
-        <w:t xml:space="preserve">5. </w:t>
-      </w:r>
-      <w:r>
-        <w:rPr>
-          <w:rFonts w:ascii="Calibri" w:hAnsi="Calibri"/>
-          <w:b/>
-          <w:sz w:val="22"/>
-        </w:rPr>
-        <w:t>Migration planning</w:t>
-      </w:r>
-      <w:r>
-        <w:rPr>
-          <w:rFonts w:ascii="Calibri" w:hAnsi="Calibri"/>
-          <w:sz w:val="22"/>
-        </w:rPr>
-        <w:t xml:space="preserve"> produced a phased, risk-minimized upgrade strategy.</w:t>
+        <w:t>Migration planning produced a phased, risk-minimized upgrade strategy.</w:t>
       </w:r>
     </w:p>
     <w:p>
       <w:pPr>
-        <w:spacing w:before="0" w:after="120"/>
-        <w:ind w:left="454" w:right="227"/>
-        <w:pBdr>
-          <w:left w:val="single" w:sz="18" w:space="8" w:color="1F3A68"/>
-        </w:pBdr>
-        <w:shd w:val="clear" w:color="auto" w:fill="F4F6FA"/>
+        <w:pStyle w:val="ListNumber"/>
+        <w:spacing w:after="80"/>
       </w:pPr>
       <w:r>
         <w:rPr>
           <w:rFonts w:ascii="Calibri" w:hAnsi="Calibri"/>
           <w:sz w:val="22"/>
         </w:rPr>
-        <w:t xml:space="preserve">6. </w:t>
-      </w:r>
-      <w:r>
-        <w:rPr>
-          <w:rFonts w:ascii="Calibri" w:hAnsi="Calibri"/>
-          <w:b/>
-          <w:sz w:val="22"/>
-        </w:rPr>
-        <w:t>Parallel execution</w:t>
-      </w:r>
-      <w:r>
-        <w:rPr>
-          <w:rFonts w:ascii="Calibri" w:hAnsi="Calibri"/>
-          <w:sz w:val="22"/>
-        </w:rPr>
-        <w:t xml:space="preserve"> with 1 Tech Lead + 4 Child Devins delivered the complete upgrade as a reviewable PR with passing CI.</w:t>
+        <w:t>Parallel execution with 1 Tech Lead + 4 Child Devins delivered the complete upgrade as a reviewable PR with passing CI.</w:t>
       </w:r>
     </w:p>
     <w:p>
       <w:pPr>
-        <w:spacing w:before="0" w:after="120"/>
-        <w:ind w:left="454" w:right="227"/>
-        <w:pBdr>
-          <w:left w:val="single" w:sz="18" w:space="8" w:color="1F3A68"/>
-        </w:pBdr>
-        <w:shd w:val="clear" w:color="auto" w:fill="F4F6FA"/>
+        <w:spacing w:after="120"/>
+        <w:ind w:left="432"/>
       </w:pPr>
       <w:r>
         <w:rPr>
@@ -3164,22 +1105,9 @@
         <w:t>This is Devin — not replacing your developers, but giving them superpowers. Thank you.</w:t>
       </w:r>
     </w:p>
-    <w:p>
-      <w:pPr>
-        <w:jc w:val="center"/>
-      </w:pPr>
-      <w:r>
-        <w:rPr>
-          <w:rFonts w:ascii="Calibri" w:hAnsi="Calibri"/>
-          <w:i/>
-          <w:color w:val="555555"/>
-        </w:rPr>
-        <w:t>— END OF TALK TRACK —</w:t>
-      </w:r>
-    </w:p>
     <w:sectPr>
       <w:pgSz w:w="12240" w:h="15840"/>
-      <w:pgMar w:top="1134" w:right="1247" w:bottom="1134" w:left="1247" w:header="720" w:footer="720" w:gutter="0"/>
+      <w:pgMar w:top="1440" w:right="1800" w:bottom="1440" w:left="1800" w:header="720" w:footer="720" w:gutter="0"/>
       <w:cols w:space="720"/>
       <w:docGrid w:linePitch="360"/>
     </w:sectPr>
@@ -3551,7 +1479,7 @@
     <w:qFormat/>
     <w:rsid w:val="00FC693F"/>
     <w:rPr>
-      <w:rFonts w:ascii="Calibri" w:hAnsi="Calibri" w:cs="Calibri" w:eastAsia="Calibri"/>
+      <w:rFonts w:ascii="Calibri" w:hAnsi="Calibri"/>
       <w:sz w:val="22"/>
     </w:rPr>
   </w:style>
@@ -3614,11 +1542,11 @@
       <w:outlineLvl w:val="0"/>
     </w:pPr>
     <w:rPr>
-      <w:rFonts w:asciiTheme="majorHAnsi" w:eastAsiaTheme="majorEastAsia" w:hAnsiTheme="majorHAnsi" w:cstheme="majorBidi" w:ascii="Calibri" w:hAnsi="Calibri" w:cs="Calibri" w:eastAsia="Calibri"/>
+      <w:rFonts w:asciiTheme="majorHAnsi" w:eastAsiaTheme="majorEastAsia" w:hAnsiTheme="majorHAnsi" w:cstheme="majorBidi" w:ascii="Calibri" w:hAnsi="Calibri"/>
       <w:b/>
       <w:bCs/>
-      <w:color w:val="365F91" w:themeColor="accent1" w:themeShade="BF"/>
-      <w:sz w:val="28"/>
+      <w:color w:val="1F3A5F"/>
+      <w:sz w:val="32"/>
       <w:szCs w:val="28"/>
     </w:rPr>
   </w:style>
@@ -3638,10 +1566,10 @@
       <w:outlineLvl w:val="1"/>
     </w:pPr>
     <w:rPr>
-      <w:rFonts w:asciiTheme="majorHAnsi" w:eastAsiaTheme="majorEastAsia" w:hAnsiTheme="majorHAnsi" w:cstheme="majorBidi" w:ascii="Calibri" w:hAnsi="Calibri" w:cs="Calibri" w:eastAsia="Calibri"/>
+      <w:rFonts w:asciiTheme="majorHAnsi" w:eastAsiaTheme="majorEastAsia" w:hAnsiTheme="majorHAnsi" w:cstheme="majorBidi" w:ascii="Calibri" w:hAnsi="Calibri"/>
       <w:b/>
       <w:bCs/>
-      <w:color w:val="4F81BD" w:themeColor="accent1"/>
+      <w:color w:val="1F3A5F"/>
       <w:sz w:val="26"/>
       <w:szCs w:val="26"/>
     </w:rPr>
@@ -3662,7 +1590,7 @@
       <w:outlineLvl w:val="2"/>
     </w:pPr>
     <w:rPr>
-      <w:rFonts w:asciiTheme="majorHAnsi" w:eastAsiaTheme="majorEastAsia" w:hAnsiTheme="majorHAnsi" w:cstheme="majorBidi" w:ascii="Calibri" w:hAnsi="Calibri" w:cs="Calibri" w:eastAsia="Calibri"/>
+      <w:rFonts w:asciiTheme="majorHAnsi" w:eastAsiaTheme="majorEastAsia" w:hAnsiTheme="majorHAnsi" w:cstheme="majorBidi"/>
       <w:b/>
       <w:bCs/>
       <w:color w:val="4F81BD" w:themeColor="accent1"/>
@@ -3903,7 +1831,7 @@
       <w:contextualSpacing/>
     </w:pPr>
     <w:rPr>
-      <w:rFonts w:asciiTheme="majorHAnsi" w:eastAsiaTheme="majorEastAsia" w:hAnsiTheme="majorHAnsi" w:cstheme="majorBidi" w:ascii="Calibri" w:hAnsi="Calibri" w:cs="Calibri" w:eastAsia="Calibri"/>
+      <w:rFonts w:asciiTheme="majorHAnsi" w:eastAsiaTheme="majorEastAsia" w:hAnsiTheme="majorHAnsi" w:cstheme="majorBidi"/>
       <w:color w:val="17365D" w:themeColor="text2" w:themeShade="BF"/>
       <w:spacing w:val="5"/>
       <w:kern w:val="28"/>
@@ -3940,7 +1868,7 @@
       </w:numPr>
     </w:pPr>
     <w:rPr>
-      <w:rFonts w:asciiTheme="majorHAnsi" w:eastAsiaTheme="majorEastAsia" w:hAnsiTheme="majorHAnsi" w:cstheme="majorBidi" w:ascii="Calibri" w:hAnsi="Calibri" w:cs="Calibri" w:eastAsia="Calibri"/>
+      <w:rFonts w:asciiTheme="majorHAnsi" w:eastAsiaTheme="majorEastAsia" w:hAnsiTheme="majorHAnsi" w:cstheme="majorBidi"/>
       <w:i/>
       <w:iCs/>
       <w:color w:val="4F81BD" w:themeColor="accent1"/>

</xml_diff>